<commit_message>
Analise de Requisitos v2
</commit_message>
<xml_diff>
--- a/AnaliseRequesitos/2016112775_RubenReis/Roles e Requisitos do SI.docx
+++ b/AnaliseRequesitos/2016112775_RubenReis/Roles e Requisitos do SI.docx
@@ -1,6 +1,6 @@
 
 <file path=word/document.xml><?xml version="1.0" encoding="utf-8"?>
-<w:document xmlns:wpc="http://schemas.microsoft.com/office/word/2010/wordprocessingCanvas" xmlns:cx="http://schemas.microsoft.com/office/drawing/2014/chartex" xmlns:cx1="http://schemas.microsoft.com/office/drawing/2015/9/8/chartex" xmlns:cx2="http://schemas.microsoft.com/office/drawing/2015/10/21/chartex" xmlns:cx3="http://schemas.microsoft.com/office/drawing/2016/5/9/chartex" xmlns:cx4="http://schemas.microsoft.com/office/drawing/2016/5/10/chartex" xmlns:cx5="http://schemas.microsoft.com/office/drawing/2016/5/11/chartex" xmlns:cx6="http://schemas.microsoft.com/office/drawing/2016/5/12/chartex" xmlns:cx7="http://schemas.microsoft.com/office/drawing/2016/5/13/chartex" xmlns:cx8="http://schemas.microsoft.com/office/drawing/2016/5/14/chartex" xmlns:mc="http://schemas.openxmlformats.org/markup-compatibility/2006" xmlns:aink="http://schemas.microsoft.com/office/drawing/2016/ink" xmlns:am3d="http://schemas.microsoft.com/office/drawing/2017/model3d" xmlns:o="urn:schemas-microsoft-com:office:office" xmlns:oel="http://schemas.microsoft.com/office/2019/extlst" xmlns:r="http://schemas.openxmlformats.org/officeDocument/2006/relationships" xmlns:m="http://schemas.openxmlformats.org/officeDocument/2006/math" xmlns:v="urn:schemas-microsoft-com:vml" xmlns:wp14="http://schemas.microsoft.com/office/word/2010/wordprocessingDrawing" xmlns:wp="http://schemas.openxmlformats.org/drawingml/2006/wordprocessingDrawing" xmlns:w10="urn:schemas-microsoft-com:office:word" xmlns:w="http://schemas.openxmlformats.org/wordprocessingml/2006/main" xmlns:w14="http://schemas.microsoft.com/office/word/2010/wordml" xmlns:w15="http://schemas.microsoft.com/office/word/2012/wordml" xmlns:w16cex="http://schemas.microsoft.com/office/word/2018/wordml/cex" xmlns:w16cid="http://schemas.microsoft.com/office/word/2016/wordml/cid" xmlns:w16="http://schemas.microsoft.com/office/word/2018/wordml" xmlns:w16sdtdh="http://schemas.microsoft.com/office/word/2020/wordml/sdtdatahash" xmlns:w16se="http://schemas.microsoft.com/office/word/2015/wordml/symex" xmlns:wpg="http://schemas.microsoft.com/office/word/2010/wordprocessingGroup" xmlns:wpi="http://schemas.microsoft.com/office/word/2010/wordprocessingInk" xmlns:wne="http://schemas.microsoft.com/office/word/2006/wordml" xmlns:wps="http://schemas.microsoft.com/office/word/2010/wordprocessingShape" mc:Ignorable="w14 w15 w16se w16cid w16 w16cex w16sdtdh wp14">
+<w:document xmlns:wpc="http://schemas.microsoft.com/office/word/2010/wordprocessingCanvas" xmlns:cx="http://schemas.microsoft.com/office/drawing/2014/chartex" xmlns:cx1="http://schemas.microsoft.com/office/drawing/2015/9/8/chartex" xmlns:cx2="http://schemas.microsoft.com/office/drawing/2015/10/21/chartex" xmlns:cx3="http://schemas.microsoft.com/office/drawing/2016/5/9/chartex" xmlns:cx4="http://schemas.microsoft.com/office/drawing/2016/5/10/chartex" xmlns:cx5="http://schemas.microsoft.com/office/drawing/2016/5/11/chartex" xmlns:cx6="http://schemas.microsoft.com/office/drawing/2016/5/12/chartex" xmlns:cx7="http://schemas.microsoft.com/office/drawing/2016/5/13/chartex" xmlns:cx8="http://schemas.microsoft.com/office/drawing/2016/5/14/chartex" xmlns:mc="http://schemas.openxmlformats.org/markup-compatibility/2006" xmlns:aink="http://schemas.microsoft.com/office/drawing/2016/ink" xmlns:am3d="http://schemas.microsoft.com/office/drawing/2017/model3d" xmlns:o="urn:schemas-microsoft-com:office:office" xmlns:oel="http://schemas.microsoft.com/office/2019/extlst" xmlns:r="http://schemas.openxmlformats.org/officeDocument/2006/relationships" xmlns:m="http://schemas.openxmlformats.org/officeDocument/2006/math" xmlns:v="urn:schemas-microsoft-com:vml" xmlns:wp14="http://schemas.microsoft.com/office/word/2010/wordprocessingDrawing" xmlns:wp="http://schemas.openxmlformats.org/drawingml/2006/wordprocessingDrawing" xmlns:w10="urn:schemas-microsoft-com:office:word" xmlns:w="http://schemas.openxmlformats.org/wordprocessingml/2006/main" xmlns:w14="http://schemas.microsoft.com/office/word/2010/wordml" xmlns:w15="http://schemas.microsoft.com/office/word/2012/wordml" xmlns:w16cex="http://schemas.microsoft.com/office/word/2018/wordml/cex" xmlns:w16cid="http://schemas.microsoft.com/office/word/2016/wordml/cid" xmlns:w16="http://schemas.microsoft.com/office/word/2018/wordml" xmlns:w16du="http://schemas.microsoft.com/office/word/2023/wordml/word16du" xmlns:w16sdtdh="http://schemas.microsoft.com/office/word/2020/wordml/sdtdatahash" xmlns:w16sdtfl="http://schemas.microsoft.com/office/word/2024/wordml/sdtformatlock" xmlns:w16se="http://schemas.microsoft.com/office/word/2015/wordml/symex" xmlns:wpg="http://schemas.microsoft.com/office/word/2010/wordprocessingGroup" xmlns:wpi="http://schemas.microsoft.com/office/word/2010/wordprocessingInk" xmlns:wne="http://schemas.microsoft.com/office/word/2006/wordml" xmlns:wps="http://schemas.microsoft.com/office/word/2010/wordprocessingShape" mc:Ignorable="w14 w15 w16se w16cid w16 w16cex w16sdtdh w16sdtfl w16du wp14">
   <w:body>
     <w:p>
       <w:pPr>
@@ -110,7 +110,7 @@
     </w:p>
     <w:tbl>
       <w:tblPr>
-        <w:tblStyle w:val="ListTable6Colorful-Accent3"/>
+        <w:tblStyle w:val="TabeladeLista6Colorida-Destaque3"/>
         <w:tblW w:w="8788" w:type="dxa"/>
         <w:tblLook w:val="04A0" w:firstRow="1" w:lastRow="0" w:firstColumn="1" w:lastColumn="0" w:noHBand="0" w:noVBand="1"/>
       </w:tblPr>
@@ -405,12 +405,24 @@
               <w:rPr>
                 <w:lang w:val="pt-PT"/>
               </w:rPr>
-              <w:t>Utilizador que trabalha no centro de adoções que pode:</w:t>
-            </w:r>
-          </w:p>
-          <w:p>
-            <w:pPr>
-              <w:pStyle w:val="ListParagraph"/>
+              <w:t>Utilizador</w:t>
+            </w:r>
+            <w:r>
+              <w:rPr>
+                <w:lang w:val="pt-PT"/>
+              </w:rPr>
+              <w:t xml:space="preserve"> autenticado</w:t>
+            </w:r>
+            <w:r>
+              <w:rPr>
+                <w:lang w:val="pt-PT"/>
+              </w:rPr>
+              <w:t xml:space="preserve"> que trabalha no centro de adoções que pode:</w:t>
+            </w:r>
+          </w:p>
+          <w:p>
+            <w:pPr>
+              <w:pStyle w:val="PargrafodaLista"/>
               <w:numPr>
                 <w:ilvl w:val="0"/>
                 <w:numId w:val="8"/>
@@ -429,7 +441,7 @@
           </w:p>
           <w:p>
             <w:pPr>
-              <w:pStyle w:val="ListParagraph"/>
+              <w:pStyle w:val="PargrafodaLista"/>
               <w:numPr>
                 <w:ilvl w:val="0"/>
                 <w:numId w:val="8"/>
@@ -448,7 +460,7 @@
           </w:p>
           <w:p>
             <w:pPr>
-              <w:pStyle w:val="ListParagraph"/>
+              <w:pStyle w:val="PargrafodaLista"/>
               <w:numPr>
                 <w:ilvl w:val="0"/>
                 <w:numId w:val="8"/>
@@ -467,7 +479,7 @@
           </w:p>
           <w:p>
             <w:pPr>
-              <w:pStyle w:val="ListParagraph"/>
+              <w:pStyle w:val="PargrafodaLista"/>
               <w:numPr>
                 <w:ilvl w:val="0"/>
                 <w:numId w:val="8"/>
@@ -562,12 +574,24 @@
               <w:rPr>
                 <w:lang w:val="pt-PT"/>
               </w:rPr>
-              <w:t>Utilizador que se voluntariou e foi aceite que pode:</w:t>
-            </w:r>
-          </w:p>
-          <w:p>
-            <w:pPr>
-              <w:pStyle w:val="ListParagraph"/>
+              <w:t>Utilizador</w:t>
+            </w:r>
+            <w:r>
+              <w:rPr>
+                <w:lang w:val="pt-PT"/>
+              </w:rPr>
+              <w:t xml:space="preserve"> autenticado</w:t>
+            </w:r>
+            <w:r>
+              <w:rPr>
+                <w:lang w:val="pt-PT"/>
+              </w:rPr>
+              <w:t xml:space="preserve"> que se voluntariou e foi aceite que pode:</w:t>
+            </w:r>
+          </w:p>
+          <w:p>
+            <w:pPr>
+              <w:pStyle w:val="PargrafodaLista"/>
               <w:numPr>
                 <w:ilvl w:val="0"/>
                 <w:numId w:val="7"/>
@@ -586,7 +610,7 @@
           </w:p>
           <w:p>
             <w:pPr>
-              <w:pStyle w:val="ListParagraph"/>
+              <w:pStyle w:val="PargrafodaLista"/>
               <w:numPr>
                 <w:ilvl w:val="0"/>
                 <w:numId w:val="7"/>
@@ -683,7 +707,7 @@
           </w:p>
           <w:p>
             <w:pPr>
-              <w:pStyle w:val="ListParagraph"/>
+              <w:pStyle w:val="PargrafodaLista"/>
               <w:numPr>
                 <w:ilvl w:val="0"/>
                 <w:numId w:val="6"/>
@@ -702,7 +726,7 @@
           </w:p>
           <w:p>
             <w:pPr>
-              <w:pStyle w:val="ListParagraph"/>
+              <w:pStyle w:val="PargrafodaLista"/>
               <w:numPr>
                 <w:ilvl w:val="0"/>
                 <w:numId w:val="6"/>
@@ -721,7 +745,7 @@
           </w:p>
           <w:p>
             <w:pPr>
-              <w:pStyle w:val="ListParagraph"/>
+              <w:pStyle w:val="PargrafodaLista"/>
               <w:numPr>
                 <w:ilvl w:val="0"/>
                 <w:numId w:val="6"/>
@@ -740,7 +764,7 @@
           </w:p>
           <w:p>
             <w:pPr>
-              <w:pStyle w:val="ListParagraph"/>
+              <w:pStyle w:val="PargrafodaLista"/>
               <w:numPr>
                 <w:ilvl w:val="0"/>
                 <w:numId w:val="6"/>
@@ -759,7 +783,7 @@
           </w:p>
           <w:p>
             <w:pPr>
-              <w:pStyle w:val="ListParagraph"/>
+              <w:pStyle w:val="PargrafodaLista"/>
               <w:numPr>
                 <w:ilvl w:val="0"/>
                 <w:numId w:val="6"/>
@@ -778,7 +802,7 @@
           </w:p>
           <w:p>
             <w:pPr>
-              <w:pStyle w:val="ListParagraph"/>
+              <w:pStyle w:val="PargrafodaLista"/>
               <w:numPr>
                 <w:ilvl w:val="0"/>
                 <w:numId w:val="6"/>
@@ -878,7 +902,7 @@
           </w:p>
           <w:p>
             <w:pPr>
-              <w:pStyle w:val="ListParagraph"/>
+              <w:pStyle w:val="PargrafodaLista"/>
               <w:numPr>
                 <w:ilvl w:val="0"/>
                 <w:numId w:val="5"/>
@@ -903,7 +927,7 @@
           </w:p>
           <w:p>
             <w:pPr>
-              <w:pStyle w:val="ListParagraph"/>
+              <w:pStyle w:val="PargrafodaLista"/>
               <w:numPr>
                 <w:ilvl w:val="0"/>
                 <w:numId w:val="5"/>
@@ -934,7 +958,7 @@
           </w:p>
           <w:p>
             <w:pPr>
-              <w:pStyle w:val="ListParagraph"/>
+              <w:pStyle w:val="PargrafodaLista"/>
               <w:numPr>
                 <w:ilvl w:val="0"/>
                 <w:numId w:val="5"/>
@@ -953,7 +977,7 @@
           </w:p>
           <w:p>
             <w:pPr>
-              <w:pStyle w:val="ListParagraph"/>
+              <w:pStyle w:val="PargrafodaLista"/>
               <w:numPr>
                 <w:ilvl w:val="0"/>
                 <w:numId w:val="5"/>
@@ -1105,7 +1129,7 @@
     </w:p>
     <w:tbl>
       <w:tblPr>
-        <w:tblStyle w:val="ListTable6Colorful-Accent3"/>
+        <w:tblStyle w:val="TabeladeLista6Colorida-Destaque3"/>
         <w:tblW w:w="9394" w:type="dxa"/>
         <w:tblLook w:val="04A0" w:firstRow="1" w:lastRow="0" w:firstColumn="1" w:lastColumn="0" w:noHBand="0" w:noVBand="1"/>
       </w:tblPr>
@@ -2333,7 +2357,7 @@
     </w:p>
     <w:tbl>
       <w:tblPr>
-        <w:tblStyle w:val="ListTable6Colorful-Accent3"/>
+        <w:tblStyle w:val="TabeladeLista6Colorida-Destaque3"/>
         <w:tblW w:w="9394" w:type="dxa"/>
         <w:tblLook w:val="04A0" w:firstRow="1" w:lastRow="0" w:firstColumn="1" w:lastColumn="0" w:noHBand="0" w:noVBand="1"/>
       </w:tblPr>
@@ -2785,7 +2809,7 @@
     </w:p>
     <w:tbl>
       <w:tblPr>
-        <w:tblStyle w:val="ListTable6Colorful-Accent3"/>
+        <w:tblStyle w:val="TabeladeLista6Colorida-Destaque3"/>
         <w:tblW w:w="9638" w:type="dxa"/>
         <w:tblLook w:val="04A0" w:firstRow="1" w:lastRow="0" w:firstColumn="1" w:lastColumn="0" w:noHBand="0" w:noVBand="1"/>
       </w:tblPr>
@@ -5709,347 +5733,6 @@
         </w:tc>
       </w:tr>
     </w:tbl>
-    <w:p>
-      <w:pPr>
-        <w:rPr>
-          <w:lang w:val="pt-PT"/>
-        </w:rPr>
-      </w:pPr>
-    </w:p>
-    <w:p>
-      <w:pPr>
-        <w:rPr>
-          <w:highlight w:val="yellow"/>
-          <w:lang w:val="pt-PT"/>
-        </w:rPr>
-      </w:pPr>
-      <w:r>
-        <w:rPr>
-          <w:highlight w:val="yellow"/>
-          <w:lang w:val="pt-PT"/>
-        </w:rPr>
-        <w:t>&lt;Devem ser descritos todos os requisitos não funcionais que o site deve apresentar (ponto de vista do que sistema deve ser). Uma tabela para cada tipo de RNF.</w:t>
-      </w:r>
-    </w:p>
-    <w:p>
-      <w:pPr>
-        <w:rPr>
-          <w:highlight w:val="yellow"/>
-          <w:lang w:val="pt-PT"/>
-        </w:rPr>
-      </w:pPr>
-      <w:r>
-        <w:rPr>
-          <w:b/>
-          <w:bCs/>
-          <w:highlight w:val="yellow"/>
-          <w:lang w:val="pt-PT"/>
-        </w:rPr>
-        <w:t>ID</w:t>
-      </w:r>
-      <w:r>
-        <w:rPr>
-          <w:highlight w:val="yellow"/>
-          <w:lang w:val="pt-PT"/>
-        </w:rPr>
-        <w:t>: Nomenclatura exemplo</w:t>
-      </w:r>
-    </w:p>
-    <w:p>
-      <w:pPr>
-        <w:rPr>
-          <w:highlight w:val="yellow"/>
-          <w:lang w:val="pt-PT"/>
-        </w:rPr>
-      </w:pPr>
-      <w:r>
-        <w:rPr>
-          <w:b/>
-          <w:bCs/>
-          <w:highlight w:val="yellow"/>
-          <w:lang w:val="pt-PT"/>
-        </w:rPr>
-        <w:t>Descrição</w:t>
-      </w:r>
-      <w:r>
-        <w:rPr>
-          <w:highlight w:val="yellow"/>
-          <w:lang w:val="pt-PT"/>
-        </w:rPr>
-        <w:t xml:space="preserve">: Sujeito + Ação (com o verbo “deve”). Ex: O sistema deve utilizar a API </w:t>
-      </w:r>
-      <w:proofErr w:type="spellStart"/>
-      <w:r>
-        <w:rPr>
-          <w:highlight w:val="yellow"/>
-          <w:lang w:val="pt-PT"/>
-        </w:rPr>
-        <w:t>xpto</w:t>
-      </w:r>
-      <w:proofErr w:type="spellEnd"/>
-      <w:r>
-        <w:rPr>
-          <w:highlight w:val="yellow"/>
-          <w:lang w:val="pt-PT"/>
-        </w:rPr>
-        <w:t xml:space="preserve">.  </w:t>
-      </w:r>
-    </w:p>
-    <w:p>
-      <w:pPr>
-        <w:rPr>
-          <w:highlight w:val="yellow"/>
-          <w:lang w:val="pt-PT"/>
-        </w:rPr>
-      </w:pPr>
-      <w:r>
-        <w:rPr>
-          <w:b/>
-          <w:bCs/>
-          <w:highlight w:val="yellow"/>
-          <w:lang w:val="pt-PT"/>
-        </w:rPr>
-        <w:t>Prioridade</w:t>
-      </w:r>
-      <w:r>
-        <w:rPr>
-          <w:highlight w:val="yellow"/>
-          <w:lang w:val="pt-PT"/>
-        </w:rPr>
-        <w:t>: Alta, Média, Baixa (diz respeito à sua implementação, se é fulcral para o objetivo do sistema)</w:t>
-      </w:r>
-    </w:p>
-    <w:p>
-      <w:pPr>
-        <w:rPr>
-          <w:highlight w:val="yellow"/>
-          <w:lang w:val="pt-PT"/>
-        </w:rPr>
-      </w:pPr>
-      <w:r>
-        <w:rPr>
-          <w:highlight w:val="yellow"/>
-          <w:lang w:val="pt-PT"/>
-        </w:rPr>
-        <w:t>Usabilidade (</w:t>
-      </w:r>
-      <w:proofErr w:type="spellStart"/>
-      <w:r>
-        <w:rPr>
-          <w:highlight w:val="yellow"/>
-          <w:lang w:val="pt-PT"/>
-        </w:rPr>
-        <w:t>Usability</w:t>
-      </w:r>
-      <w:proofErr w:type="spellEnd"/>
-      <w:r>
-        <w:rPr>
-          <w:highlight w:val="yellow"/>
-          <w:lang w:val="pt-PT"/>
-        </w:rPr>
-        <w:t xml:space="preserve">) – foca-se na perspetiva da interação com o utilizador (facilidade de uso). Ex: A interface do website deve ser </w:t>
-      </w:r>
-      <w:proofErr w:type="spellStart"/>
-      <w:r>
-        <w:rPr>
-          <w:highlight w:val="yellow"/>
-          <w:lang w:val="pt-PT"/>
-        </w:rPr>
-        <w:t>user-friendly</w:t>
-      </w:r>
-      <w:proofErr w:type="spellEnd"/>
-      <w:r>
-        <w:rPr>
-          <w:highlight w:val="yellow"/>
-          <w:lang w:val="pt-PT"/>
-        </w:rPr>
-        <w:t xml:space="preserve"> e fácil de usar.</w:t>
-      </w:r>
-    </w:p>
-    <w:p>
-      <w:pPr>
-        <w:rPr>
-          <w:highlight w:val="yellow"/>
-          <w:lang w:val="pt-PT"/>
-        </w:rPr>
-      </w:pPr>
-      <w:r>
-        <w:rPr>
-          <w:highlight w:val="yellow"/>
-          <w:lang w:val="pt-PT"/>
-        </w:rPr>
-        <w:t>Fiabilidade (</w:t>
-      </w:r>
-      <w:proofErr w:type="spellStart"/>
-      <w:r>
-        <w:rPr>
-          <w:highlight w:val="yellow"/>
-          <w:lang w:val="pt-PT"/>
-        </w:rPr>
-        <w:t>Reliability</w:t>
-      </w:r>
-      <w:proofErr w:type="spellEnd"/>
-      <w:r>
-        <w:rPr>
-          <w:highlight w:val="yellow"/>
-          <w:lang w:val="pt-PT"/>
-        </w:rPr>
-        <w:t>) – habilidade do software se comportar de forma consistente e aceitável para o utilizador; é a probabilidade e percentagem do software funcionar sem falhas para um período específico de tempo ou uso. Ex: Os candidatos devem aceder aos seus currículos 98% das vezes, sem falhas.</w:t>
-      </w:r>
-    </w:p>
-    <w:p>
-      <w:pPr>
-        <w:rPr>
-          <w:highlight w:val="yellow"/>
-          <w:lang w:val="pt-PT"/>
-        </w:rPr>
-      </w:pPr>
-      <w:r>
-        <w:rPr>
-          <w:highlight w:val="yellow"/>
-          <w:lang w:val="pt-PT"/>
-        </w:rPr>
-        <w:t>Segurança (</w:t>
-      </w:r>
-      <w:proofErr w:type="spellStart"/>
-      <w:r>
-        <w:rPr>
-          <w:highlight w:val="yellow"/>
-          <w:lang w:val="pt-PT"/>
-        </w:rPr>
-        <w:t>Security</w:t>
-      </w:r>
-      <w:proofErr w:type="spellEnd"/>
-      <w:r>
-        <w:rPr>
-          <w:highlight w:val="yellow"/>
-          <w:lang w:val="pt-PT"/>
-        </w:rPr>
-        <w:t>) – define como o sistema se encontra protegido ou como deve ser efetuado o acesso ao sistema. Ex: Devem ser efetuadas 2 cópias de segurança dos dados do sistema diariamente, sendo que 1 delas deve encontrar-se em local externo.</w:t>
-      </w:r>
-    </w:p>
-    <w:p>
-      <w:pPr>
-        <w:rPr>
-          <w:highlight w:val="yellow"/>
-          <w:lang w:val="pt-PT"/>
-        </w:rPr>
-      </w:pPr>
-      <w:r>
-        <w:rPr>
-          <w:highlight w:val="yellow"/>
-          <w:lang w:val="pt-PT"/>
-        </w:rPr>
-        <w:t>Eficiência (Performance) – definem o quão bem o sistema lida com capacidade, taxa de transferência e tempo de resposta (desempenho, espaço, tempo) Ex: O tempo de carregamento do website não deve superior a 1 segundo.</w:t>
-      </w:r>
-    </w:p>
-    <w:p>
-      <w:pPr>
-        <w:rPr>
-          <w:highlight w:val="yellow"/>
-          <w:lang w:val="pt-PT"/>
-        </w:rPr>
-      </w:pPr>
-      <w:r>
-        <w:rPr>
-          <w:highlight w:val="yellow"/>
-          <w:lang w:val="pt-PT"/>
-        </w:rPr>
-        <w:t>Disponibilidade (</w:t>
-      </w:r>
-      <w:proofErr w:type="spellStart"/>
-      <w:r>
-        <w:rPr>
-          <w:highlight w:val="yellow"/>
-          <w:lang w:val="pt-PT"/>
-        </w:rPr>
-        <w:t>Availability</w:t>
-      </w:r>
-      <w:proofErr w:type="spellEnd"/>
-      <w:r>
-        <w:rPr>
-          <w:highlight w:val="yellow"/>
-          <w:lang w:val="pt-PT"/>
-        </w:rPr>
-        <w:t>) – define o tempo de funcionamento do sistema, o tempo que leva para reparar uma falha e o tempo entre ciclos. Ex: O diretor de recursos humanos deve poder publicar empregos no site durante a semana e ao fim-de-semana, a qualquer hora do dia (disponibilidade 24x7).</w:t>
-      </w:r>
-    </w:p>
-    <w:p>
-      <w:pPr>
-        <w:rPr>
-          <w:highlight w:val="yellow"/>
-          <w:lang w:val="pt-PT"/>
-        </w:rPr>
-      </w:pPr>
-      <w:r>
-        <w:rPr>
-          <w:highlight w:val="yellow"/>
-          <w:lang w:val="pt-PT"/>
-        </w:rPr>
-        <w:t>Ambiente (</w:t>
-      </w:r>
-      <w:proofErr w:type="spellStart"/>
-      <w:r>
-        <w:rPr>
-          <w:highlight w:val="yellow"/>
-          <w:lang w:val="pt-PT"/>
-        </w:rPr>
-        <w:t>Portability</w:t>
-      </w:r>
-      <w:proofErr w:type="spellEnd"/>
-      <w:r>
-        <w:rPr>
-          <w:highlight w:val="yellow"/>
-          <w:lang w:val="pt-PT"/>
-        </w:rPr>
-        <w:t>) – especificam o ambiente operacional do sistema (capacidade de adaptação). Ex: O sistema deve ser capaz de correr no SO Windows e Linux.</w:t>
-      </w:r>
-    </w:p>
-    <w:p>
-      <w:pPr>
-        <w:rPr>
-          <w:highlight w:val="yellow"/>
-          <w:lang w:val="pt-PT"/>
-        </w:rPr>
-      </w:pPr>
-      <w:r>
-        <w:rPr>
-          <w:highlight w:val="yellow"/>
-          <w:lang w:val="pt-PT"/>
-        </w:rPr>
-        <w:t>Desenvolvimento (</w:t>
-      </w:r>
-      <w:proofErr w:type="spellStart"/>
-      <w:r>
-        <w:rPr>
-          <w:highlight w:val="yellow"/>
-          <w:lang w:val="pt-PT"/>
-        </w:rPr>
-        <w:t>Implementation</w:t>
-      </w:r>
-      <w:proofErr w:type="spellEnd"/>
-      <w:r>
-        <w:rPr>
-          <w:highlight w:val="yellow"/>
-          <w:lang w:val="pt-PT"/>
-        </w:rPr>
-        <w:t>) – indicam restrições ao uso de ferramentas ou linguagens de programação; ou do desenvolvimento do projeto em si; standards. Ex: O sistema deve ser desenvolvido utilizando a linguagem de programação Java.</w:t>
-      </w:r>
-    </w:p>
-    <w:p>
-      <w:pPr>
-        <w:rPr>
-          <w:lang w:val="pt-PT"/>
-        </w:rPr>
-      </w:pPr>
-      <w:r>
-        <w:rPr>
-          <w:highlight w:val="yellow"/>
-          <w:lang w:val="pt-PT"/>
-        </w:rPr>
-        <w:t>&gt;</w:t>
-      </w:r>
-    </w:p>
     <w:p>
       <w:pPr>
         <w:rPr>
@@ -6121,14 +5804,14 @@
     </w:p>
     <w:tbl>
       <w:tblPr>
-        <w:tblStyle w:val="ListTable6Colorful-Accent3"/>
+        <w:tblStyle w:val="TabeladeLista6Colorida-Destaque3"/>
         <w:tblW w:w="9356" w:type="dxa"/>
         <w:tblLook w:val="04A0" w:firstRow="1" w:lastRow="0" w:firstColumn="1" w:lastColumn="0" w:noHBand="0" w:noVBand="1"/>
       </w:tblPr>
       <w:tblGrid>
-        <w:gridCol w:w="1134"/>
-        <w:gridCol w:w="5670"/>
-        <w:gridCol w:w="1380"/>
+        <w:gridCol w:w="1112"/>
+        <w:gridCol w:w="5473"/>
+        <w:gridCol w:w="1599"/>
         <w:gridCol w:w="1172"/>
       </w:tblGrid>
       <w:tr>
@@ -6138,7 +5821,7 @@
         <w:tc>
           <w:tcPr>
             <w:cnfStyle w:val="001000000000" w:firstRow="0" w:lastRow="0" w:firstColumn="1" w:lastColumn="0" w:oddVBand="0" w:evenVBand="0" w:oddHBand="0" w:evenHBand="0" w:firstRowFirstColumn="0" w:firstRowLastColumn="0" w:lastRowFirstColumn="0" w:lastRowLastColumn="0"/>
-            <w:tcW w:w="1134" w:type="dxa"/>
+            <w:tcW w:w="1112" w:type="dxa"/>
           </w:tcPr>
           <w:p>
             <w:pPr>
@@ -6157,7 +5840,7 @@
         </w:tc>
         <w:tc>
           <w:tcPr>
-            <w:tcW w:w="5670" w:type="dxa"/>
+            <w:tcW w:w="5473" w:type="dxa"/>
           </w:tcPr>
           <w:p>
             <w:pPr>
@@ -6177,7 +5860,7 @@
         </w:tc>
         <w:tc>
           <w:tcPr>
-            <w:tcW w:w="1380" w:type="dxa"/>
+            <w:tcW w:w="1599" w:type="dxa"/>
           </w:tcPr>
           <w:p>
             <w:pPr>
@@ -6219,11 +5902,12 @@
       <w:tr>
         <w:trPr>
           <w:cnfStyle w:val="000000100000" w:firstRow="0" w:lastRow="0" w:firstColumn="0" w:lastColumn="0" w:oddVBand="0" w:evenVBand="0" w:oddHBand="1" w:evenHBand="0" w:firstRowFirstColumn="0" w:firstRowLastColumn="0" w:lastRowFirstColumn="0" w:lastRowLastColumn="0"/>
+          <w:trHeight w:val="703"/>
         </w:trPr>
         <w:tc>
           <w:tcPr>
             <w:cnfStyle w:val="001000000000" w:firstRow="0" w:lastRow="0" w:firstColumn="1" w:lastColumn="0" w:oddVBand="0" w:evenVBand="0" w:oddHBand="0" w:evenHBand="0" w:firstRowFirstColumn="0" w:firstRowLastColumn="0" w:lastRowFirstColumn="0" w:lastRowLastColumn="0"/>
-            <w:tcW w:w="1134" w:type="dxa"/>
+            <w:tcW w:w="1112" w:type="dxa"/>
           </w:tcPr>
           <w:p>
             <w:pPr>
@@ -6242,27 +5926,27 @@
         </w:tc>
         <w:tc>
           <w:tcPr>
-            <w:tcW w:w="5670" w:type="dxa"/>
-          </w:tcPr>
-          <w:p>
-            <w:pPr>
-              <w:spacing w:after="160"/>
-              <w:cnfStyle w:val="000000100000" w:firstRow="0" w:lastRow="0" w:firstColumn="0" w:lastColumn="0" w:oddVBand="0" w:evenVBand="0" w:oddHBand="1" w:evenHBand="0" w:firstRowFirstColumn="0" w:firstRowLastColumn="0" w:lastRowFirstColumn="0" w:lastRowLastColumn="0"/>
-              <w:rPr>
-                <w:lang w:val="pt-PT"/>
-              </w:rPr>
-            </w:pPr>
-            <w:r>
-              <w:rPr>
-                <w:lang w:val="pt-PT"/>
-              </w:rPr>
-              <w:t>Validações de dados inseridos em formulários</w:t>
-            </w:r>
-          </w:p>
-        </w:tc>
-        <w:tc>
-          <w:tcPr>
-            <w:tcW w:w="1380" w:type="dxa"/>
+            <w:tcW w:w="5473" w:type="dxa"/>
+          </w:tcPr>
+          <w:p>
+            <w:pPr>
+              <w:spacing w:after="160"/>
+              <w:cnfStyle w:val="000000100000" w:firstRow="0" w:lastRow="0" w:firstColumn="0" w:lastColumn="0" w:oddVBand="0" w:evenVBand="0" w:oddHBand="1" w:evenHBand="0" w:firstRowFirstColumn="0" w:firstRowLastColumn="0" w:lastRowFirstColumn="0" w:lastRowLastColumn="0"/>
+              <w:rPr>
+                <w:lang w:val="pt-PT"/>
+              </w:rPr>
+            </w:pPr>
+            <w:r>
+              <w:rPr>
+                <w:lang w:val="pt-PT"/>
+              </w:rPr>
+              <w:t>Todos os dados inseridos devem ser validados para evitar falhas de segurança</w:t>
+            </w:r>
+          </w:p>
+        </w:tc>
+        <w:tc>
+          <w:tcPr>
+            <w:tcW w:w="1599" w:type="dxa"/>
           </w:tcPr>
           <w:p>
             <w:pPr>
@@ -6302,10 +5986,13 @@
         </w:tc>
       </w:tr>
       <w:tr>
+        <w:trPr>
+          <w:trHeight w:val="703"/>
+        </w:trPr>
         <w:tc>
           <w:tcPr>
             <w:cnfStyle w:val="001000000000" w:firstRow="0" w:lastRow="0" w:firstColumn="1" w:lastColumn="0" w:oddVBand="0" w:evenVBand="0" w:oddHBand="0" w:evenHBand="0" w:firstRowFirstColumn="0" w:firstRowLastColumn="0" w:lastRowFirstColumn="0" w:lastRowLastColumn="0"/>
-            <w:tcW w:w="1134" w:type="dxa"/>
+            <w:tcW w:w="1112" w:type="dxa"/>
           </w:tcPr>
           <w:p>
             <w:pPr>
@@ -6324,39 +6011,41 @@
         </w:tc>
         <w:tc>
           <w:tcPr>
-            <w:tcW w:w="5670" w:type="dxa"/>
-          </w:tcPr>
-          <w:p>
-            <w:pPr>
-              <w:spacing w:after="160"/>
-              <w:cnfStyle w:val="000000000000" w:firstRow="0" w:lastRow="0" w:firstColumn="0" w:lastColumn="0" w:oddVBand="0" w:evenVBand="0" w:oddHBand="0" w:evenHBand="0" w:firstRowFirstColumn="0" w:firstRowLastColumn="0" w:lastRowFirstColumn="0" w:lastRowLastColumn="0"/>
-              <w:rPr>
-                <w:lang w:val="pt-PT"/>
-              </w:rPr>
-            </w:pPr>
-          </w:p>
-          <w:p>
-            <w:pPr>
-              <w:spacing w:after="160"/>
-              <w:cnfStyle w:val="000000000000" w:firstRow="0" w:lastRow="0" w:firstColumn="0" w:lastColumn="0" w:oddVBand="0" w:evenVBand="0" w:oddHBand="0" w:evenHBand="0" w:firstRowFirstColumn="0" w:firstRowLastColumn="0" w:lastRowFirstColumn="0" w:lastRowLastColumn="0"/>
-              <w:rPr>
-                <w:lang w:val="pt-PT"/>
-              </w:rPr>
-            </w:pPr>
-          </w:p>
-        </w:tc>
-        <w:tc>
-          <w:tcPr>
-            <w:tcW w:w="1380" w:type="dxa"/>
-          </w:tcPr>
-          <w:p>
-            <w:pPr>
-              <w:spacing w:after="160"/>
-              <w:cnfStyle w:val="000000000000" w:firstRow="0" w:lastRow="0" w:firstColumn="0" w:lastColumn="0" w:oddVBand="0" w:evenVBand="0" w:oddHBand="0" w:evenHBand="0" w:firstRowFirstColumn="0" w:firstRowLastColumn="0" w:lastRowFirstColumn="0" w:lastRowLastColumn="0"/>
-              <w:rPr>
-                <w:lang w:val="pt-PT"/>
-              </w:rPr>
-            </w:pPr>
+            <w:tcW w:w="5473" w:type="dxa"/>
+          </w:tcPr>
+          <w:p>
+            <w:pPr>
+              <w:cnfStyle w:val="000000000000" w:firstRow="0" w:lastRow="0" w:firstColumn="0" w:lastColumn="0" w:oddVBand="0" w:evenVBand="0" w:oddHBand="0" w:evenHBand="0" w:firstRowFirstColumn="0" w:firstRowLastColumn="0" w:lastRowFirstColumn="0" w:lastRowLastColumn="0"/>
+              <w:rPr>
+                <w:lang w:val="pt-PT"/>
+              </w:rPr>
+            </w:pPr>
+            <w:r>
+              <w:rPr>
+                <w:lang w:val="pt-PT"/>
+              </w:rPr>
+              <w:t>O site deve estar disponível 24h por dia e apenas estar indisponível se previamente avisado através de mensagens importantes</w:t>
+            </w:r>
+          </w:p>
+        </w:tc>
+        <w:tc>
+          <w:tcPr>
+            <w:tcW w:w="1599" w:type="dxa"/>
+          </w:tcPr>
+          <w:p>
+            <w:pPr>
+              <w:spacing w:after="160"/>
+              <w:cnfStyle w:val="000000000000" w:firstRow="0" w:lastRow="0" w:firstColumn="0" w:lastColumn="0" w:oddVBand="0" w:evenVBand="0" w:oddHBand="0" w:evenHBand="0" w:firstRowFirstColumn="0" w:firstRowLastColumn="0" w:lastRowFirstColumn="0" w:lastRowLastColumn="0"/>
+              <w:rPr>
+                <w:lang w:val="pt-PT"/>
+              </w:rPr>
+            </w:pPr>
+            <w:r>
+              <w:rPr>
+                <w:lang w:val="pt-PT"/>
+              </w:rPr>
+              <w:t>Disponibilidade</w:t>
+            </w:r>
           </w:p>
         </w:tc>
         <w:tc>
@@ -6371,17 +6060,24 @@
                 <w:lang w:val="pt-PT"/>
               </w:rPr>
             </w:pPr>
+            <w:r>
+              <w:rPr>
+                <w:lang w:val="pt-PT"/>
+              </w:rPr>
+              <w:t>Alta</w:t>
+            </w:r>
           </w:p>
         </w:tc>
       </w:tr>
       <w:tr>
         <w:trPr>
           <w:cnfStyle w:val="000000100000" w:firstRow="0" w:lastRow="0" w:firstColumn="0" w:lastColumn="0" w:oddVBand="0" w:evenVBand="0" w:oddHBand="1" w:evenHBand="0" w:firstRowFirstColumn="0" w:firstRowLastColumn="0" w:lastRowFirstColumn="0" w:lastRowLastColumn="0"/>
+          <w:trHeight w:val="703"/>
         </w:trPr>
         <w:tc>
           <w:tcPr>
             <w:cnfStyle w:val="001000000000" w:firstRow="0" w:lastRow="0" w:firstColumn="1" w:lastColumn="0" w:oddVBand="0" w:evenVBand="0" w:oddHBand="0" w:evenHBand="0" w:firstRowFirstColumn="0" w:firstRowLastColumn="0" w:lastRowFirstColumn="0" w:lastRowLastColumn="0"/>
-            <w:tcW w:w="1134" w:type="dxa"/>
+            <w:tcW w:w="1112" w:type="dxa"/>
           </w:tcPr>
           <w:p>
             <w:pPr>
@@ -6400,30 +6096,54 @@
         </w:tc>
         <w:tc>
           <w:tcPr>
-            <w:tcW w:w="5670" w:type="dxa"/>
-          </w:tcPr>
-          <w:p>
-            <w:pPr>
-              <w:spacing w:after="160"/>
-              <w:cnfStyle w:val="000000100000" w:firstRow="0" w:lastRow="0" w:firstColumn="0" w:lastColumn="0" w:oddVBand="0" w:evenVBand="0" w:oddHBand="1" w:evenHBand="0" w:firstRowFirstColumn="0" w:firstRowLastColumn="0" w:lastRowFirstColumn="0" w:lastRowLastColumn="0"/>
-              <w:rPr>
-                <w:lang w:val="pt-PT"/>
-              </w:rPr>
-            </w:pPr>
-          </w:p>
-        </w:tc>
-        <w:tc>
-          <w:tcPr>
-            <w:tcW w:w="1380" w:type="dxa"/>
-          </w:tcPr>
-          <w:p>
-            <w:pPr>
-              <w:spacing w:after="160"/>
-              <w:cnfStyle w:val="000000100000" w:firstRow="0" w:lastRow="0" w:firstColumn="0" w:lastColumn="0" w:oddVBand="0" w:evenVBand="0" w:oddHBand="1" w:evenHBand="0" w:firstRowFirstColumn="0" w:firstRowLastColumn="0" w:lastRowFirstColumn="0" w:lastRowLastColumn="0"/>
-              <w:rPr>
-                <w:lang w:val="pt-PT"/>
-              </w:rPr>
-            </w:pPr>
+            <w:tcW w:w="5473" w:type="dxa"/>
+          </w:tcPr>
+          <w:p>
+            <w:pPr>
+              <w:spacing w:after="160"/>
+              <w:cnfStyle w:val="000000100000" w:firstRow="0" w:lastRow="0" w:firstColumn="0" w:lastColumn="0" w:oddVBand="0" w:evenVBand="0" w:oddHBand="1" w:evenHBand="0" w:firstRowFirstColumn="0" w:firstRowLastColumn="0" w:lastRowFirstColumn="0" w:lastRowLastColumn="0"/>
+              <w:rPr>
+                <w:lang w:val="pt-PT"/>
+              </w:rPr>
+            </w:pPr>
+            <w:r>
+              <w:rPr>
+                <w:lang w:val="pt-PT"/>
+              </w:rPr>
+              <w:t>A interface do site deve ser intuitiva para o utilizador</w:t>
+            </w:r>
+            <w:r>
+              <w:rPr>
+                <w:lang w:val="pt-PT"/>
+              </w:rPr>
+              <w:t xml:space="preserve"> desde o início</w:t>
+            </w:r>
+            <w:r>
+              <w:rPr>
+                <w:lang w:val="pt-PT"/>
+              </w:rPr>
+              <w:t xml:space="preserve"> </w:t>
+            </w:r>
+          </w:p>
+        </w:tc>
+        <w:tc>
+          <w:tcPr>
+            <w:tcW w:w="1599" w:type="dxa"/>
+          </w:tcPr>
+          <w:p>
+            <w:pPr>
+              <w:spacing w:after="160"/>
+              <w:cnfStyle w:val="000000100000" w:firstRow="0" w:lastRow="0" w:firstColumn="0" w:lastColumn="0" w:oddVBand="0" w:evenVBand="0" w:oddHBand="1" w:evenHBand="0" w:firstRowFirstColumn="0" w:firstRowLastColumn="0" w:lastRowFirstColumn="0" w:lastRowLastColumn="0"/>
+              <w:rPr>
+                <w:lang w:val="pt-PT"/>
+              </w:rPr>
+            </w:pPr>
+            <w:r>
+              <w:rPr>
+                <w:lang w:val="pt-PT"/>
+              </w:rPr>
+              <w:t>Usabilidade</w:t>
+            </w:r>
           </w:p>
         </w:tc>
         <w:tc>
@@ -6438,117 +6158,83 @@
                 <w:lang w:val="pt-PT"/>
               </w:rPr>
             </w:pPr>
-          </w:p>
-        </w:tc>
-      </w:tr>
-      <w:tr>
-        <w:tc>
-          <w:tcPr>
-            <w:cnfStyle w:val="001000000000" w:firstRow="0" w:lastRow="0" w:firstColumn="1" w:lastColumn="0" w:oddVBand="0" w:evenVBand="0" w:oddHBand="0" w:evenHBand="0" w:firstRowFirstColumn="0" w:firstRowLastColumn="0" w:lastRowFirstColumn="0" w:lastRowLastColumn="0"/>
-            <w:tcW w:w="1134" w:type="dxa"/>
-          </w:tcPr>
-          <w:p>
-            <w:pPr>
-              <w:spacing w:after="160"/>
-              <w:rPr>
-                <w:lang w:val="pt-PT"/>
-              </w:rPr>
-            </w:pPr>
-            <w:r>
-              <w:rPr>
-                <w:lang w:val="pt-PT"/>
-              </w:rPr>
-              <w:t>RNF-04</w:t>
-            </w:r>
-          </w:p>
-        </w:tc>
-        <w:tc>
-          <w:tcPr>
-            <w:tcW w:w="5670" w:type="dxa"/>
-          </w:tcPr>
-          <w:p>
-            <w:pPr>
-              <w:spacing w:after="160"/>
-              <w:cnfStyle w:val="000000000000" w:firstRow="0" w:lastRow="0" w:firstColumn="0" w:lastColumn="0" w:oddVBand="0" w:evenVBand="0" w:oddHBand="0" w:evenHBand="0" w:firstRowFirstColumn="0" w:firstRowLastColumn="0" w:lastRowFirstColumn="0" w:lastRowLastColumn="0"/>
-              <w:rPr>
-                <w:lang w:val="pt-PT"/>
-              </w:rPr>
-            </w:pPr>
-          </w:p>
-        </w:tc>
-        <w:tc>
-          <w:tcPr>
-            <w:tcW w:w="1380" w:type="dxa"/>
-          </w:tcPr>
-          <w:p>
-            <w:pPr>
-              <w:spacing w:after="160"/>
-              <w:cnfStyle w:val="000000000000" w:firstRow="0" w:lastRow="0" w:firstColumn="0" w:lastColumn="0" w:oddVBand="0" w:evenVBand="0" w:oddHBand="0" w:evenHBand="0" w:firstRowFirstColumn="0" w:firstRowLastColumn="0" w:lastRowFirstColumn="0" w:lastRowLastColumn="0"/>
-              <w:rPr>
-                <w:lang w:val="pt-PT"/>
-              </w:rPr>
-            </w:pPr>
-          </w:p>
-        </w:tc>
-        <w:tc>
-          <w:tcPr>
-            <w:tcW w:w="1172" w:type="dxa"/>
-          </w:tcPr>
-          <w:p>
-            <w:pPr>
-              <w:spacing w:after="160"/>
-              <w:cnfStyle w:val="000000000000" w:firstRow="0" w:lastRow="0" w:firstColumn="0" w:lastColumn="0" w:oddVBand="0" w:evenVBand="0" w:oddHBand="0" w:evenHBand="0" w:firstRowFirstColumn="0" w:firstRowLastColumn="0" w:lastRowFirstColumn="0" w:lastRowLastColumn="0"/>
-              <w:rPr>
-                <w:lang w:val="pt-PT"/>
-              </w:rPr>
-            </w:pPr>
+            <w:r>
+              <w:rPr>
+                <w:lang w:val="pt-PT"/>
+              </w:rPr>
+              <w:t>Média</w:t>
+            </w:r>
           </w:p>
         </w:tc>
       </w:tr>
       <w:tr>
         <w:trPr>
-          <w:cnfStyle w:val="000000100000" w:firstRow="0" w:lastRow="0" w:firstColumn="0" w:lastColumn="0" w:oddVBand="0" w:evenVBand="0" w:oddHBand="1" w:evenHBand="0" w:firstRowFirstColumn="0" w:firstRowLastColumn="0" w:lastRowFirstColumn="0" w:lastRowLastColumn="0"/>
+          <w:trHeight w:val="703"/>
         </w:trPr>
         <w:tc>
           <w:tcPr>
             <w:cnfStyle w:val="001000000000" w:firstRow="0" w:lastRow="0" w:firstColumn="1" w:lastColumn="0" w:oddVBand="0" w:evenVBand="0" w:oddHBand="0" w:evenHBand="0" w:firstRowFirstColumn="0" w:firstRowLastColumn="0" w:lastRowFirstColumn="0" w:lastRowLastColumn="0"/>
-            <w:tcW w:w="1134" w:type="dxa"/>
-          </w:tcPr>
-          <w:p>
-            <w:pPr>
-              <w:spacing w:after="160"/>
-              <w:rPr>
-                <w:lang w:val="pt-PT"/>
-              </w:rPr>
-            </w:pPr>
-          </w:p>
-        </w:tc>
-        <w:tc>
-          <w:tcPr>
-            <w:tcW w:w="5670" w:type="dxa"/>
-          </w:tcPr>
-          <w:p>
-            <w:pPr>
-              <w:spacing w:after="160"/>
-              <w:cnfStyle w:val="000000100000" w:firstRow="0" w:lastRow="0" w:firstColumn="0" w:lastColumn="0" w:oddVBand="0" w:evenVBand="0" w:oddHBand="1" w:evenHBand="0" w:firstRowFirstColumn="0" w:firstRowLastColumn="0" w:lastRowFirstColumn="0" w:lastRowLastColumn="0"/>
-              <w:rPr>
-                <w:lang w:val="pt-PT"/>
-              </w:rPr>
-            </w:pPr>
-          </w:p>
-        </w:tc>
-        <w:tc>
-          <w:tcPr>
-            <w:tcW w:w="1380" w:type="dxa"/>
-          </w:tcPr>
-          <w:p>
-            <w:pPr>
-              <w:spacing w:after="160"/>
-              <w:cnfStyle w:val="000000100000" w:firstRow="0" w:lastRow="0" w:firstColumn="0" w:lastColumn="0" w:oddVBand="0" w:evenVBand="0" w:oddHBand="1" w:evenHBand="0" w:firstRowFirstColumn="0" w:firstRowLastColumn="0" w:lastRowFirstColumn="0" w:lastRowLastColumn="0"/>
-              <w:rPr>
-                <w:lang w:val="pt-PT"/>
-              </w:rPr>
-            </w:pPr>
+            <w:tcW w:w="1112" w:type="dxa"/>
+          </w:tcPr>
+          <w:p>
+            <w:pPr>
+              <w:spacing w:after="160"/>
+              <w:rPr>
+                <w:lang w:val="pt-PT"/>
+              </w:rPr>
+            </w:pPr>
+            <w:r>
+              <w:rPr>
+                <w:lang w:val="pt-PT"/>
+              </w:rPr>
+              <w:t>RNF-04</w:t>
+            </w:r>
+          </w:p>
+        </w:tc>
+        <w:tc>
+          <w:tcPr>
+            <w:tcW w:w="5473" w:type="dxa"/>
+          </w:tcPr>
+          <w:p>
+            <w:pPr>
+              <w:spacing w:after="160"/>
+              <w:cnfStyle w:val="000000000000" w:firstRow="0" w:lastRow="0" w:firstColumn="0" w:lastColumn="0" w:oddVBand="0" w:evenVBand="0" w:oddHBand="0" w:evenHBand="0" w:firstRowFirstColumn="0" w:firstRowLastColumn="0" w:lastRowFirstColumn="0" w:lastRowLastColumn="0"/>
+              <w:rPr>
+                <w:lang w:val="pt-PT"/>
+              </w:rPr>
+            </w:pPr>
+            <w:r>
+              <w:rPr>
+                <w:lang w:val="pt-PT"/>
+              </w:rPr>
+              <w:t xml:space="preserve">O </w:t>
+            </w:r>
+            <w:r>
+              <w:rPr>
+                <w:lang w:val="pt-PT"/>
+              </w:rPr>
+              <w:t>tempo entre funções no site não deve exceder 400ms</w:t>
+            </w:r>
+          </w:p>
+        </w:tc>
+        <w:tc>
+          <w:tcPr>
+            <w:tcW w:w="1599" w:type="dxa"/>
+          </w:tcPr>
+          <w:p>
+            <w:pPr>
+              <w:spacing w:after="160"/>
+              <w:cnfStyle w:val="000000000000" w:firstRow="0" w:lastRow="0" w:firstColumn="0" w:lastColumn="0" w:oddVBand="0" w:evenVBand="0" w:oddHBand="0" w:evenHBand="0" w:firstRowFirstColumn="0" w:firstRowLastColumn="0" w:lastRowFirstColumn="0" w:lastRowLastColumn="0"/>
+              <w:rPr>
+                <w:lang w:val="pt-PT"/>
+              </w:rPr>
+            </w:pPr>
+            <w:r>
+              <w:rPr>
+                <w:lang w:val="pt-PT"/>
+              </w:rPr>
+              <w:t>Eficiência</w:t>
+            </w:r>
           </w:p>
         </w:tc>
         <w:tc>
@@ -6558,130 +6244,17 @@
           <w:p>
             <w:pPr>
               <w:spacing w:after="160"/>
-              <w:cnfStyle w:val="000000100000" w:firstRow="0" w:lastRow="0" w:firstColumn="0" w:lastColumn="0" w:oddVBand="0" w:evenVBand="0" w:oddHBand="1" w:evenHBand="0" w:firstRowFirstColumn="0" w:firstRowLastColumn="0" w:lastRowFirstColumn="0" w:lastRowLastColumn="0"/>
-              <w:rPr>
-                <w:lang w:val="pt-PT"/>
-              </w:rPr>
-            </w:pPr>
-          </w:p>
-        </w:tc>
-      </w:tr>
-      <w:tr>
-        <w:tc>
-          <w:tcPr>
-            <w:cnfStyle w:val="001000000000" w:firstRow="0" w:lastRow="0" w:firstColumn="1" w:lastColumn="0" w:oddVBand="0" w:evenVBand="0" w:oddHBand="0" w:evenHBand="0" w:firstRowFirstColumn="0" w:firstRowLastColumn="0" w:lastRowFirstColumn="0" w:lastRowLastColumn="0"/>
-            <w:tcW w:w="1134" w:type="dxa"/>
-          </w:tcPr>
-          <w:p>
-            <w:pPr>
-              <w:spacing w:after="160"/>
-              <w:rPr>
-                <w:lang w:val="pt-PT"/>
-              </w:rPr>
-            </w:pPr>
-          </w:p>
-        </w:tc>
-        <w:tc>
-          <w:tcPr>
-            <w:tcW w:w="5670" w:type="dxa"/>
-          </w:tcPr>
-          <w:p>
-            <w:pPr>
-              <w:spacing w:after="160"/>
-              <w:cnfStyle w:val="000000000000" w:firstRow="0" w:lastRow="0" w:firstColumn="0" w:lastColumn="0" w:oddVBand="0" w:evenVBand="0" w:oddHBand="0" w:evenHBand="0" w:firstRowFirstColumn="0" w:firstRowLastColumn="0" w:lastRowFirstColumn="0" w:lastRowLastColumn="0"/>
-              <w:rPr>
-                <w:lang w:val="pt-PT"/>
-              </w:rPr>
-            </w:pPr>
-          </w:p>
-        </w:tc>
-        <w:tc>
-          <w:tcPr>
-            <w:tcW w:w="1380" w:type="dxa"/>
-          </w:tcPr>
-          <w:p>
-            <w:pPr>
-              <w:spacing w:after="160"/>
-              <w:cnfStyle w:val="000000000000" w:firstRow="0" w:lastRow="0" w:firstColumn="0" w:lastColumn="0" w:oddVBand="0" w:evenVBand="0" w:oddHBand="0" w:evenHBand="0" w:firstRowFirstColumn="0" w:firstRowLastColumn="0" w:lastRowFirstColumn="0" w:lastRowLastColumn="0"/>
-              <w:rPr>
-                <w:lang w:val="pt-PT"/>
-              </w:rPr>
-            </w:pPr>
-          </w:p>
-        </w:tc>
-        <w:tc>
-          <w:tcPr>
-            <w:tcW w:w="1172" w:type="dxa"/>
-          </w:tcPr>
-          <w:p>
-            <w:pPr>
-              <w:spacing w:after="160"/>
-              <w:cnfStyle w:val="000000000000" w:firstRow="0" w:lastRow="0" w:firstColumn="0" w:lastColumn="0" w:oddVBand="0" w:evenVBand="0" w:oddHBand="0" w:evenHBand="0" w:firstRowFirstColumn="0" w:firstRowLastColumn="0" w:lastRowFirstColumn="0" w:lastRowLastColumn="0"/>
-              <w:rPr>
-                <w:lang w:val="pt-PT"/>
-              </w:rPr>
-            </w:pPr>
-          </w:p>
-        </w:tc>
-      </w:tr>
-      <w:tr>
-        <w:trPr>
-          <w:cnfStyle w:val="000000100000" w:firstRow="0" w:lastRow="0" w:firstColumn="0" w:lastColumn="0" w:oddVBand="0" w:evenVBand="0" w:oddHBand="1" w:evenHBand="0" w:firstRowFirstColumn="0" w:firstRowLastColumn="0" w:lastRowFirstColumn="0" w:lastRowLastColumn="0"/>
-        </w:trPr>
-        <w:tc>
-          <w:tcPr>
-            <w:cnfStyle w:val="001000000000" w:firstRow="0" w:lastRow="0" w:firstColumn="1" w:lastColumn="0" w:oddVBand="0" w:evenVBand="0" w:oddHBand="0" w:evenHBand="0" w:firstRowFirstColumn="0" w:firstRowLastColumn="0" w:lastRowFirstColumn="0" w:lastRowLastColumn="0"/>
-            <w:tcW w:w="1134" w:type="dxa"/>
-          </w:tcPr>
-          <w:p>
-            <w:pPr>
-              <w:spacing w:after="160"/>
-              <w:rPr>
-                <w:lang w:val="pt-PT"/>
-              </w:rPr>
-            </w:pPr>
-          </w:p>
-        </w:tc>
-        <w:tc>
-          <w:tcPr>
-            <w:tcW w:w="5670" w:type="dxa"/>
-          </w:tcPr>
-          <w:p>
-            <w:pPr>
-              <w:spacing w:after="160"/>
-              <w:cnfStyle w:val="000000100000" w:firstRow="0" w:lastRow="0" w:firstColumn="0" w:lastColumn="0" w:oddVBand="0" w:evenVBand="0" w:oddHBand="1" w:evenHBand="0" w:firstRowFirstColumn="0" w:firstRowLastColumn="0" w:lastRowFirstColumn="0" w:lastRowLastColumn="0"/>
-              <w:rPr>
-                <w:lang w:val="pt-PT"/>
-              </w:rPr>
-            </w:pPr>
-          </w:p>
-        </w:tc>
-        <w:tc>
-          <w:tcPr>
-            <w:tcW w:w="1380" w:type="dxa"/>
-          </w:tcPr>
-          <w:p>
-            <w:pPr>
-              <w:spacing w:after="160"/>
-              <w:cnfStyle w:val="000000100000" w:firstRow="0" w:lastRow="0" w:firstColumn="0" w:lastColumn="0" w:oddVBand="0" w:evenVBand="0" w:oddHBand="1" w:evenHBand="0" w:firstRowFirstColumn="0" w:firstRowLastColumn="0" w:lastRowFirstColumn="0" w:lastRowLastColumn="0"/>
-              <w:rPr>
-                <w:lang w:val="pt-PT"/>
-              </w:rPr>
-            </w:pPr>
-          </w:p>
-        </w:tc>
-        <w:tc>
-          <w:tcPr>
-            <w:tcW w:w="1172" w:type="dxa"/>
-          </w:tcPr>
-          <w:p>
-            <w:pPr>
-              <w:spacing w:after="160"/>
-              <w:cnfStyle w:val="000000100000" w:firstRow="0" w:lastRow="0" w:firstColumn="0" w:lastColumn="0" w:oddVBand="0" w:evenVBand="0" w:oddHBand="1" w:evenHBand="0" w:firstRowFirstColumn="0" w:firstRowLastColumn="0" w:lastRowFirstColumn="0" w:lastRowLastColumn="0"/>
-              <w:rPr>
-                <w:lang w:val="pt-PT"/>
-              </w:rPr>
-            </w:pPr>
+              <w:cnfStyle w:val="000000000000" w:firstRow="0" w:lastRow="0" w:firstColumn="0" w:lastColumn="0" w:oddVBand="0" w:evenVBand="0" w:oddHBand="0" w:evenHBand="0" w:firstRowFirstColumn="0" w:firstRowLastColumn="0" w:lastRowFirstColumn="0" w:lastRowLastColumn="0"/>
+              <w:rPr>
+                <w:lang w:val="pt-PT"/>
+              </w:rPr>
+            </w:pPr>
+            <w:r>
+              <w:rPr>
+                <w:lang w:val="pt-PT"/>
+              </w:rPr>
+              <w:t>Média</w:t>
+            </w:r>
           </w:p>
         </w:tc>
       </w:tr>
@@ -6703,7 +6276,6 @@
     <w:p>
       <w:pPr>
         <w:rPr>
-          <w:b/>
           <w:lang w:val="pt-PT"/>
         </w:rPr>
       </w:pPr>
@@ -6735,463 +6307,9 @@
       <w:bookmarkEnd w:id="5"/>
       <w:proofErr w:type="spellEnd"/>
     </w:p>
-    <w:p>
-      <w:pPr>
-        <w:rPr>
-          <w:highlight w:val="yellow"/>
-          <w:lang w:val="pt-PT"/>
-        </w:rPr>
-      </w:pPr>
-      <w:r>
-        <w:rPr>
-          <w:highlight w:val="yellow"/>
-          <w:lang w:val="pt-PT"/>
-        </w:rPr>
-        <w:t xml:space="preserve">&lt;Devem ser especificados os requisitos funcionais do ponto de vista do utilizador sob forma de </w:t>
-      </w:r>
-      <w:proofErr w:type="spellStart"/>
-      <w:r>
-        <w:rPr>
-          <w:highlight w:val="yellow"/>
-          <w:lang w:val="pt-PT"/>
-        </w:rPr>
-        <w:t>User</w:t>
-      </w:r>
-      <w:proofErr w:type="spellEnd"/>
-      <w:r>
-        <w:rPr>
-          <w:highlight w:val="yellow"/>
-          <w:lang w:val="pt-PT"/>
-        </w:rPr>
-        <w:t xml:space="preserve"> </w:t>
-      </w:r>
-      <w:proofErr w:type="spellStart"/>
-      <w:r>
-        <w:rPr>
-          <w:highlight w:val="yellow"/>
-          <w:lang w:val="pt-PT"/>
-        </w:rPr>
-        <w:t>Stories</w:t>
-      </w:r>
-      <w:proofErr w:type="spellEnd"/>
-      <w:r>
-        <w:rPr>
-          <w:highlight w:val="yellow"/>
-          <w:lang w:val="pt-PT"/>
-        </w:rPr>
-        <w:t xml:space="preserve"> As </w:t>
-      </w:r>
-      <w:proofErr w:type="spellStart"/>
-      <w:r>
-        <w:rPr>
-          <w:i/>
-          <w:iCs/>
-          <w:highlight w:val="yellow"/>
-          <w:lang w:val="pt-PT"/>
-        </w:rPr>
-        <w:t>issues</w:t>
-      </w:r>
-      <w:proofErr w:type="spellEnd"/>
-      <w:r>
-        <w:rPr>
-          <w:highlight w:val="yellow"/>
-          <w:lang w:val="pt-PT"/>
-        </w:rPr>
-        <w:t xml:space="preserve"> devem ser estimadas em </w:t>
-      </w:r>
-      <w:proofErr w:type="spellStart"/>
-      <w:r>
-        <w:rPr>
-          <w:highlight w:val="yellow"/>
-          <w:lang w:val="pt-PT"/>
-        </w:rPr>
-        <w:t>Story</w:t>
-      </w:r>
-      <w:proofErr w:type="spellEnd"/>
-      <w:r>
-        <w:rPr>
-          <w:highlight w:val="yellow"/>
-          <w:lang w:val="pt-PT"/>
-        </w:rPr>
-        <w:t xml:space="preserve"> </w:t>
-      </w:r>
-      <w:proofErr w:type="spellStart"/>
-      <w:r>
-        <w:rPr>
-          <w:highlight w:val="yellow"/>
-          <w:lang w:val="pt-PT"/>
-        </w:rPr>
-        <w:t>Points</w:t>
-      </w:r>
-      <w:proofErr w:type="spellEnd"/>
-      <w:r>
-        <w:rPr>
-          <w:highlight w:val="yellow"/>
-          <w:lang w:val="pt-PT"/>
-        </w:rPr>
-        <w:t xml:space="preserve"> utilizando a sequência de </w:t>
-      </w:r>
-      <w:proofErr w:type="spellStart"/>
-      <w:r>
-        <w:rPr>
-          <w:highlight w:val="yellow"/>
-          <w:lang w:val="pt-PT"/>
-        </w:rPr>
-        <w:t>Fibonacci</w:t>
-      </w:r>
-      <w:proofErr w:type="spellEnd"/>
-      <w:r>
-        <w:rPr>
-          <w:highlight w:val="yellow"/>
-          <w:lang w:val="pt-PT"/>
-        </w:rPr>
-        <w:t>: 1, 2, 3, 5, 8, 13, 2</w:t>
-      </w:r>
-      <w:r>
-        <w:rPr>
-          <w:highlight w:val="yellow"/>
-          <w:lang w:val="pt-PT"/>
-        </w:rPr>
-        <w:t>1</w:t>
-      </w:r>
-      <w:r>
-        <w:rPr>
-          <w:highlight w:val="yellow"/>
-          <w:lang w:val="pt-PT"/>
-        </w:rPr>
-        <w:t xml:space="preserve"> (</w:t>
-      </w:r>
-      <w:proofErr w:type="spellStart"/>
-      <w:r>
-        <w:rPr>
-          <w:highlight w:val="yellow"/>
-          <w:lang w:val="pt-PT"/>
-        </w:rPr>
-        <w:t>máx</w:t>
-      </w:r>
-      <w:proofErr w:type="spellEnd"/>
-      <w:r>
-        <w:rPr>
-          <w:highlight w:val="yellow"/>
-          <w:lang w:val="pt-PT"/>
-        </w:rPr>
-        <w:t>).&gt;</w:t>
-      </w:r>
-      <w:r>
-        <w:rPr>
-          <w:highlight w:val="yellow"/>
-          <w:lang w:val="pt-PT"/>
-        </w:rPr>
-        <w:t xml:space="preserve"> </w:t>
-      </w:r>
-    </w:p>
-    <w:p>
-      <w:pPr>
-        <w:rPr>
-          <w:highlight w:val="yellow"/>
-          <w:lang w:val="pt-PT"/>
-        </w:rPr>
-      </w:pPr>
-      <w:r>
-        <w:rPr>
-          <w:highlight w:val="yellow"/>
-          <w:lang w:val="pt-PT"/>
-        </w:rPr>
-        <w:t>//Fibonacci-1,2,3, 2+3, n-n-1,</w:t>
-      </w:r>
-    </w:p>
-    <w:p>
-      <w:pPr>
-        <w:rPr>
-          <w:highlight w:val="green"/>
-          <w:lang w:val="pt-PT"/>
-        </w:rPr>
-      </w:pPr>
-      <w:r>
-        <w:rPr>
-          <w:highlight w:val="green"/>
-          <w:lang w:val="pt-PT"/>
-        </w:rPr>
-        <w:t>//Meu-------</w:t>
-      </w:r>
-      <w:proofErr w:type="spellStart"/>
-      <w:r>
-        <w:rPr>
-          <w:highlight w:val="green"/>
-          <w:lang w:val="pt-PT"/>
-        </w:rPr>
-        <w:t>Story</w:t>
-      </w:r>
-      <w:proofErr w:type="spellEnd"/>
-      <w:r>
-        <w:rPr>
-          <w:highlight w:val="green"/>
-          <w:lang w:val="pt-PT"/>
-        </w:rPr>
-        <w:t xml:space="preserve"> </w:t>
-      </w:r>
-      <w:proofErr w:type="spellStart"/>
-      <w:r>
-        <w:rPr>
-          <w:highlight w:val="green"/>
-          <w:lang w:val="pt-PT"/>
-        </w:rPr>
-        <w:t>Points</w:t>
-      </w:r>
-      <w:proofErr w:type="spellEnd"/>
-      <w:r>
-        <w:rPr>
-          <w:highlight w:val="green"/>
-          <w:lang w:val="pt-PT"/>
-        </w:rPr>
-        <w:t xml:space="preserve">-são utilizadas para indicar o nível de complexidade e esforço necessário para implementar a </w:t>
-      </w:r>
-      <w:proofErr w:type="spellStart"/>
-      <w:r>
-        <w:rPr>
-          <w:highlight w:val="green"/>
-          <w:lang w:val="pt-PT"/>
-        </w:rPr>
-        <w:t>User</w:t>
-      </w:r>
-      <w:proofErr w:type="spellEnd"/>
-      <w:r>
-        <w:rPr>
-          <w:highlight w:val="green"/>
-          <w:lang w:val="pt-PT"/>
-        </w:rPr>
-        <w:t xml:space="preserve"> </w:t>
-      </w:r>
-      <w:proofErr w:type="spellStart"/>
-      <w:r>
-        <w:rPr>
-          <w:highlight w:val="green"/>
-          <w:lang w:val="pt-PT"/>
-        </w:rPr>
-        <w:t>story</w:t>
-      </w:r>
-      <w:proofErr w:type="spellEnd"/>
-      <w:r>
-        <w:rPr>
-          <w:highlight w:val="green"/>
-          <w:lang w:val="pt-PT"/>
-        </w:rPr>
-        <w:t>; quanto mais alta mais complexa é de implementar</w:t>
-      </w:r>
-    </w:p>
-    <w:p>
-      <w:pPr>
-        <w:rPr>
-          <w:highlight w:val="yellow"/>
-          <w:lang w:val="en-US"/>
-        </w:rPr>
-      </w:pPr>
-      <w:r>
-        <w:rPr>
-          <w:highlight w:val="yellow"/>
-          <w:lang w:val="en-US"/>
-        </w:rPr>
-        <w:t>As a &lt;role&gt;, I want &lt;goal/desire&gt; so that &lt;benefit&gt;</w:t>
-      </w:r>
-    </w:p>
-    <w:p>
-      <w:pPr>
-        <w:rPr>
-          <w:highlight w:val="yellow"/>
-          <w:lang w:val="pt-PT"/>
-        </w:rPr>
-      </w:pPr>
-      <w:r>
-        <w:rPr>
-          <w:highlight w:val="yellow"/>
-          <w:lang w:val="pt-PT"/>
-        </w:rPr>
-        <w:t>(Como um &lt;função&gt;, eu quero &lt;objetivo/desejo&gt; para que &lt;benefício&gt;)</w:t>
-      </w:r>
-    </w:p>
-    <w:p>
-      <w:pPr>
-        <w:rPr>
-          <w:highlight w:val="yellow"/>
-          <w:lang w:val="pt-PT"/>
-        </w:rPr>
-      </w:pPr>
-      <w:r>
-        <w:rPr>
-          <w:highlight w:val="yellow"/>
-          <w:lang w:val="pt-PT"/>
-        </w:rPr>
-        <w:t xml:space="preserve">Exemplo: </w:t>
-      </w:r>
-      <w:r>
-        <w:rPr>
-          <w:b/>
-          <w:bCs/>
-          <w:highlight w:val="yellow"/>
-          <w:u w:val="single"/>
-          <w:lang w:val="pt-PT"/>
-        </w:rPr>
-        <w:t>Como</w:t>
-      </w:r>
-      <w:r>
-        <w:rPr>
-          <w:highlight w:val="yellow"/>
-          <w:lang w:val="pt-PT"/>
-        </w:rPr>
-        <w:t xml:space="preserve"> Administrador de Bases de Dados, </w:t>
-      </w:r>
-      <w:r>
-        <w:rPr>
-          <w:b/>
-          <w:bCs/>
-          <w:highlight w:val="yellow"/>
-          <w:u w:val="single"/>
-          <w:lang w:val="pt-PT"/>
-        </w:rPr>
-        <w:t>eu devo</w:t>
-      </w:r>
-      <w:r>
-        <w:rPr>
-          <w:highlight w:val="yellow"/>
-          <w:lang w:val="pt-PT"/>
-        </w:rPr>
-        <w:t xml:space="preserve"> ser capaz de reverter um número selecionado de dados </w:t>
-      </w:r>
-      <w:r>
-        <w:rPr>
-          <w:b/>
-          <w:bCs/>
-          <w:highlight w:val="yellow"/>
-          <w:u w:val="single"/>
-          <w:lang w:val="pt-PT"/>
-        </w:rPr>
-        <w:t>para que</w:t>
-      </w:r>
-      <w:r>
-        <w:rPr>
-          <w:highlight w:val="yellow"/>
-          <w:lang w:val="pt-PT"/>
-        </w:rPr>
-        <w:t xml:space="preserve"> a versão anterior a eles seja restaurada.</w:t>
-      </w:r>
-    </w:p>
-    <w:p>
-      <w:pPr>
-        <w:rPr>
-          <w:highlight w:val="yellow"/>
-          <w:lang w:val="pt-PT"/>
-        </w:rPr>
-      </w:pPr>
-      <w:r>
-        <w:rPr>
-          <w:highlight w:val="yellow"/>
-          <w:lang w:val="pt-PT"/>
-        </w:rPr>
-        <w:t xml:space="preserve">Focar nestes 3 e evitar o Como (excluir aspetos de desenho, interface design </w:t>
-      </w:r>
-      <w:proofErr w:type="spellStart"/>
-      <w:r>
-        <w:rPr>
-          <w:highlight w:val="yellow"/>
-          <w:lang w:val="pt-PT"/>
-        </w:rPr>
-        <w:t>statements</w:t>
-      </w:r>
-      <w:proofErr w:type="spellEnd"/>
-      <w:r>
-        <w:rPr>
-          <w:highlight w:val="yellow"/>
-          <w:lang w:val="pt-PT"/>
-        </w:rPr>
-        <w:t>).</w:t>
-      </w:r>
-    </w:p>
-    <w:p>
-      <w:pPr>
-        <w:rPr>
-          <w:highlight w:val="yellow"/>
-          <w:lang w:val="pt-PT"/>
-        </w:rPr>
-      </w:pPr>
-      <w:r>
-        <w:rPr>
-          <w:highlight w:val="yellow"/>
-          <w:lang w:val="pt-PT"/>
-        </w:rPr>
-        <w:t>“Como [persona],” – Para quem estamos a construir isto? Não estamos atrás de um título de trabalho, estamos atrás da persona da pessoa. Entendemos como a pessoa funciona, como pensa e como se sente.</w:t>
-      </w:r>
-    </w:p>
-    <w:p>
-      <w:pPr>
-        <w:rPr>
-          <w:highlight w:val="yellow"/>
-          <w:lang w:val="pt-PT"/>
-        </w:rPr>
-      </w:pPr>
-      <w:r>
-        <w:rPr>
-          <w:highlight w:val="yellow"/>
-          <w:lang w:val="pt-PT"/>
-        </w:rPr>
-        <w:t>“eu [quero/gostaria que],” – Aqui descrevemos o intuito, mas não as funcionalidades que eles usam. O que é que eles estão a tentar atingir? Deve ser livre da implementação – se estivermos a descrever algo específico da UI, e não o objetivo do utilizador, estamos a perder o objetivo.</w:t>
-      </w:r>
-    </w:p>
-    <w:p>
-      <w:pPr>
-        <w:rPr>
-          <w:lang w:val="pt-PT"/>
-        </w:rPr>
-      </w:pPr>
-      <w:r>
-        <w:rPr>
-          <w:highlight w:val="yellow"/>
-          <w:lang w:val="pt-PT"/>
-        </w:rPr>
-        <w:t xml:space="preserve">“[para quê].” – como é que o desejo imediato deles para fazer algo se integra na </w:t>
-      </w:r>
-      <w:proofErr w:type="spellStart"/>
-      <w:r>
-        <w:rPr>
-          <w:highlight w:val="yellow"/>
-          <w:lang w:val="pt-PT"/>
-        </w:rPr>
-        <w:t>big</w:t>
-      </w:r>
-      <w:proofErr w:type="spellEnd"/>
-      <w:r>
-        <w:rPr>
-          <w:highlight w:val="yellow"/>
-          <w:lang w:val="pt-PT"/>
-        </w:rPr>
-        <w:t xml:space="preserve"> </w:t>
-      </w:r>
-      <w:proofErr w:type="spellStart"/>
-      <w:r>
-        <w:rPr>
-          <w:highlight w:val="yellow"/>
-          <w:lang w:val="pt-PT"/>
-        </w:rPr>
-        <w:t>picture</w:t>
-      </w:r>
-      <w:proofErr w:type="spellEnd"/>
-      <w:r>
-        <w:rPr>
-          <w:highlight w:val="yellow"/>
-          <w:lang w:val="pt-PT"/>
-        </w:rPr>
-        <w:t>? Qual o objetivo geral que estão a tentar atingir? Qual o principal problema que precisa de ser resolvido?</w:t>
-      </w:r>
-    </w:p>
-    <w:p>
-      <w:pPr>
-        <w:rPr>
-          <w:lang w:val="pt-PT"/>
-        </w:rPr>
-      </w:pPr>
-    </w:p>
     <w:tbl>
       <w:tblPr>
-        <w:tblStyle w:val="GridTable2-Accent3"/>
+        <w:tblStyle w:val="TabeladeGrelha2-Destaque3"/>
         <w:tblW w:w="9639" w:type="dxa"/>
         <w:tblLook w:val="04A0" w:firstRow="1" w:lastRow="0" w:firstColumn="1" w:lastColumn="0" w:noHBand="0" w:noVBand="1"/>
       </w:tblPr>
@@ -7252,7 +6370,13 @@
               <w:rPr>
                 <w:lang w:val="pt-PT"/>
               </w:rPr>
-              <w:t>Título: US1 – Efetuar lançamento de dados</w:t>
+              <w:t xml:space="preserve">Título: US1 – </w:t>
+            </w:r>
+            <w:r>
+              <w:rPr>
+                <w:lang w:val="pt-PT"/>
+              </w:rPr>
+              <w:t>Registo</w:t>
             </w:r>
           </w:p>
         </w:tc>
@@ -7280,7 +6404,13 @@
               <w:rPr>
                 <w:lang w:val="pt-PT"/>
               </w:rPr>
-              <w:t>: 3</w:t>
+              <w:t xml:space="preserve">: </w:t>
+            </w:r>
+            <w:r>
+              <w:rPr>
+                <w:lang w:val="pt-PT"/>
+              </w:rPr>
+              <w:t>5</w:t>
             </w:r>
           </w:p>
         </w:tc>
@@ -7303,7 +6433,25 @@
               <w:rPr>
                 <w:lang w:val="pt-PT"/>
               </w:rPr>
-              <w:t>Descrição: Como jogador quero ser capaz de lançar os dados de forma a poder fazer a jogada</w:t>
+              <w:t xml:space="preserve">Descrição: Como </w:t>
+            </w:r>
+            <w:r>
+              <w:rPr>
+                <w:lang w:val="pt-PT"/>
+              </w:rPr>
+              <w:t xml:space="preserve">visitante </w:t>
+            </w:r>
+            <w:r>
+              <w:rPr>
+                <w:lang w:val="pt-PT"/>
+              </w:rPr>
+              <w:t xml:space="preserve">quero </w:t>
+            </w:r>
+            <w:r>
+              <w:rPr>
+                <w:lang w:val="pt-PT"/>
+              </w:rPr>
+              <w:t>poder criar e aceder a uma conta para poder aceder e visualizar o conteúdo restringido a estas.</w:t>
             </w:r>
           </w:p>
           <w:p>
@@ -7335,7 +6483,7 @@
               <w:rPr>
                 <w:lang w:val="pt-PT"/>
               </w:rPr>
-              <w:t>Só é possível efetuar uma jogada de cada vez</w:t>
+              <w:t>Os campos de nome, email e morada são obrigatórios;</w:t>
             </w:r>
           </w:p>
           <w:p>
@@ -7351,10 +6499,27 @@
             </w:pPr>
             <w:r>
               <w:rPr>
-                <w:highlight w:val="yellow"/>
-                <w:lang w:val="pt-PT"/>
-              </w:rPr>
-              <w:t>As faces dos dados têm de ser visíveis após o lançamento</w:t>
+                <w:lang w:val="pt-PT"/>
+              </w:rPr>
+              <w:t>Não podem existir múltiplos utilizadores com o mesmo NIF;</w:t>
+            </w:r>
+          </w:p>
+          <w:p>
+            <w:pPr>
+              <w:numPr>
+                <w:ilvl w:val="0"/>
+                <w:numId w:val="1"/>
+              </w:numPr>
+              <w:spacing w:after="160" w:line="259" w:lineRule="auto"/>
+              <w:rPr>
+                <w:lang w:val="pt-PT"/>
+              </w:rPr>
+            </w:pPr>
+            <w:r>
+              <w:rPr>
+                <w:lang w:val="pt-PT"/>
+              </w:rPr>
+              <w:t>Esta conta não pode ter sido bloqueada por razões de segurança;</w:t>
             </w:r>
           </w:p>
         </w:tc>
@@ -7379,14 +6544,25 @@
               <w:rPr>
                 <w:lang w:val="pt-PT"/>
               </w:rPr>
-              <w:t xml:space="preserve">Título: US2 – </w:t>
-            </w:r>
-            <w:r>
-              <w:rPr>
-                <w:highlight w:val="yellow"/>
-                <w:lang w:val="pt-PT"/>
-              </w:rPr>
-              <w:t>Adicionar cliente</w:t>
+              <w:t>Título: US</w:t>
+            </w:r>
+            <w:r>
+              <w:rPr>
+                <w:lang w:val="pt-PT"/>
+              </w:rPr>
+              <w:t>2</w:t>
+            </w:r>
+            <w:r>
+              <w:rPr>
+                <w:lang w:val="pt-PT"/>
+              </w:rPr>
+              <w:t xml:space="preserve"> –</w:t>
+            </w:r>
+            <w:r>
+              <w:rPr>
+                <w:lang w:val="pt-PT"/>
+              </w:rPr>
+              <w:t xml:space="preserve"> Adoção</w:t>
             </w:r>
           </w:p>
         </w:tc>
@@ -7414,7 +6590,19 @@
               <w:rPr>
                 <w:lang w:val="pt-PT"/>
               </w:rPr>
-              <w:t>: 5</w:t>
+              <w:t>:</w:t>
+            </w:r>
+            <w:r>
+              <w:rPr>
+                <w:lang w:val="pt-PT"/>
+              </w:rPr>
+              <w:t xml:space="preserve"> </w:t>
+            </w:r>
+            <w:r>
+              <w:rPr>
+                <w:lang w:val="pt-PT"/>
+              </w:rPr>
+              <w:t>5</w:t>
             </w:r>
           </w:p>
         </w:tc>
@@ -7437,14 +6625,13 @@
               <w:rPr>
                 <w:lang w:val="pt-PT"/>
               </w:rPr>
-              <w:t xml:space="preserve">Descrição: </w:t>
-            </w:r>
-            <w:r>
-              <w:rPr>
-                <w:highlight w:val="yellow"/>
-                <w:lang w:val="pt-PT"/>
-              </w:rPr>
-              <w:t>Como utilizador quero poder adicionar um cliente de modo a ficar registado</w:t>
+              <w:t>Descrição:</w:t>
+            </w:r>
+            <w:r>
+              <w:rPr>
+                <w:lang w:val="pt-PT"/>
+              </w:rPr>
+              <w:t xml:space="preserve"> Como utilizador quero poder iniciar um processo para adotar um animal.</w:t>
             </w:r>
           </w:p>
           <w:p>
@@ -7465,27 +6652,25 @@
             <w:pPr>
               <w:numPr>
                 <w:ilvl w:val="0"/>
-                <w:numId w:val="1"/>
+                <w:numId w:val="3"/>
               </w:numPr>
               <w:spacing w:after="160" w:line="259" w:lineRule="auto"/>
               <w:rPr>
-                <w:highlight w:val="yellow"/>
-                <w:lang w:val="pt-PT"/>
-              </w:rPr>
-            </w:pPr>
-            <w:r>
-              <w:rPr>
-                <w:highlight w:val="yellow"/>
-                <w:lang w:val="pt-PT"/>
-              </w:rPr>
-              <w:t>Os campos nome, morada, contato e NIF têm de ser obrigatoriamente preenchidos</w:t>
+                <w:lang w:val="pt-PT"/>
+              </w:rPr>
+            </w:pPr>
+            <w:r>
+              <w:rPr>
+                <w:lang w:val="pt-PT"/>
+              </w:rPr>
+              <w:t>É necessário pesquisar que animais estão disponíveis para adoção, sendo possível usar filtros para fazer pesquisas especificas e escolher o animal que se pretende adotar;</w:t>
             </w:r>
           </w:p>
           <w:p>
             <w:pPr>
               <w:numPr>
                 <w:ilvl w:val="0"/>
-                <w:numId w:val="1"/>
+                <w:numId w:val="3"/>
               </w:numPr>
               <w:spacing w:after="160" w:line="259" w:lineRule="auto"/>
               <w:rPr>
@@ -7494,11 +6679,27 @@
             </w:pPr>
             <w:r>
               <w:rPr>
-                <w:highlight w:val="yellow"/>
-                <w:lang w:val="pt-PT"/>
-              </w:rPr>
-              <w:lastRenderedPageBreak/>
-              <w:t>Não pode haver um cliente com o mesmo NIF</w:t>
+                <w:lang w:val="pt-PT"/>
+              </w:rPr>
+              <w:t>É necessário estar autenticado numa conta e esta ter um NIF associado;</w:t>
+            </w:r>
+          </w:p>
+          <w:p>
+            <w:pPr>
+              <w:numPr>
+                <w:ilvl w:val="0"/>
+                <w:numId w:val="3"/>
+              </w:numPr>
+              <w:spacing w:after="160" w:line="259" w:lineRule="auto"/>
+              <w:rPr>
+                <w:lang w:val="pt-PT"/>
+              </w:rPr>
+            </w:pPr>
+            <w:r>
+              <w:rPr>
+                <w:lang w:val="pt-PT"/>
+              </w:rPr>
+              <w:t>Este processo só poderá ser aceite por um funcionário autenticado;</w:t>
             </w:r>
           </w:p>
         </w:tc>
@@ -7523,8 +6724,19 @@
               <w:rPr>
                 <w:lang w:val="pt-PT"/>
               </w:rPr>
-              <w:lastRenderedPageBreak/>
-              <w:t xml:space="preserve">Título: US – </w:t>
+              <w:t>Título: US</w:t>
+            </w:r>
+            <w:r>
+              <w:rPr>
+                <w:lang w:val="pt-PT"/>
+              </w:rPr>
+              <w:t xml:space="preserve">3 – </w:t>
+            </w:r>
+            <w:r>
+              <w:rPr>
+                <w:lang w:val="pt-PT"/>
+              </w:rPr>
+              <w:t>Horários</w:t>
             </w:r>
           </w:p>
         </w:tc>
@@ -7553,6 +6765,18 @@
                 <w:lang w:val="pt-PT"/>
               </w:rPr>
               <w:t>:</w:t>
+            </w:r>
+            <w:r>
+              <w:rPr>
+                <w:lang w:val="pt-PT"/>
+              </w:rPr>
+              <w:t xml:space="preserve"> </w:t>
+            </w:r>
+            <w:r>
+              <w:rPr>
+                <w:lang w:val="pt-PT"/>
+              </w:rPr>
+              <w:t>8</w:t>
             </w:r>
           </w:p>
         </w:tc>
@@ -7577,6 +6801,18 @@
               </w:rPr>
               <w:t>Descrição:</w:t>
             </w:r>
+            <w:r>
+              <w:rPr>
+                <w:lang w:val="pt-PT"/>
+              </w:rPr>
+              <w:t xml:space="preserve"> Como funcionário ou voluntário quero poder visualizar os meus horários</w:t>
+            </w:r>
+            <w:r>
+              <w:rPr>
+                <w:lang w:val="pt-PT"/>
+              </w:rPr>
+              <w:t>.</w:t>
+            </w:r>
           </w:p>
           <w:p>
             <w:pPr>
@@ -7596,13 +6832,52 @@
             <w:pPr>
               <w:numPr>
                 <w:ilvl w:val="0"/>
-                <w:numId w:val="3"/>
+                <w:numId w:val="2"/>
               </w:numPr>
               <w:spacing w:after="160" w:line="259" w:lineRule="auto"/>
               <w:rPr>
                 <w:lang w:val="pt-PT"/>
               </w:rPr>
             </w:pPr>
+            <w:r>
+              <w:rPr>
+                <w:lang w:val="pt-PT"/>
+              </w:rPr>
+              <w:lastRenderedPageBreak/>
+              <w:t>É necessário estar autenticado na conta respetiva;</w:t>
+            </w:r>
+          </w:p>
+          <w:p>
+            <w:pPr>
+              <w:numPr>
+                <w:ilvl w:val="0"/>
+                <w:numId w:val="2"/>
+              </w:numPr>
+              <w:spacing w:after="160" w:line="259" w:lineRule="auto"/>
+              <w:rPr>
+                <w:lang w:val="pt-PT"/>
+              </w:rPr>
+            </w:pPr>
+            <w:r>
+              <w:rPr>
+                <w:lang w:val="pt-PT"/>
+              </w:rPr>
+              <w:t xml:space="preserve">Será apenas possível ver os horários respetivos se e apenas se estes tenham sido criados no </w:t>
+            </w:r>
+            <w:proofErr w:type="spellStart"/>
+            <w:r>
+              <w:rPr>
+                <w:lang w:val="pt-PT"/>
+              </w:rPr>
+              <w:t>backoffice</w:t>
+            </w:r>
+            <w:proofErr w:type="spellEnd"/>
+            <w:r>
+              <w:rPr>
+                <w:lang w:val="pt-PT"/>
+              </w:rPr>
+              <w:t>;</w:t>
+            </w:r>
           </w:p>
         </w:tc>
       </w:tr>
@@ -7626,7 +6901,14 @@
               <w:rPr>
                 <w:lang w:val="pt-PT"/>
               </w:rPr>
+              <w:lastRenderedPageBreak/>
               <w:t>Título: US</w:t>
+            </w:r>
+            <w:r>
+              <w:rPr>
+                <w:lang w:val="pt-PT"/>
+              </w:rPr>
+              <w:t>4 - Consultas</w:t>
             </w:r>
           </w:p>
         </w:tc>
@@ -7655,6 +6937,18 @@
                 <w:lang w:val="pt-PT"/>
               </w:rPr>
               <w:t>:</w:t>
+            </w:r>
+            <w:r>
+              <w:rPr>
+                <w:lang w:val="pt-PT"/>
+              </w:rPr>
+              <w:t xml:space="preserve"> </w:t>
+            </w:r>
+            <w:r>
+              <w:rPr>
+                <w:lang w:val="pt-PT"/>
+              </w:rPr>
+              <w:t>5</w:t>
             </w:r>
           </w:p>
         </w:tc>
@@ -7678,6 +6972,12 @@
                 <w:lang w:val="pt-PT"/>
               </w:rPr>
               <w:t>Descrição:</w:t>
+            </w:r>
+            <w:r>
+              <w:rPr>
+                <w:lang w:val="pt-PT"/>
+              </w:rPr>
+              <w:t xml:space="preserve"> Como utilizador quero poder inscrever o meu animal numa consulta.</w:t>
             </w:r>
           </w:p>
           <w:p>
@@ -7705,6 +7005,48 @@
                 <w:lang w:val="pt-PT"/>
               </w:rPr>
             </w:pPr>
+            <w:r>
+              <w:rPr>
+                <w:lang w:val="pt-PT"/>
+              </w:rPr>
+              <w:t>É necessário estar autenticado;</w:t>
+            </w:r>
+          </w:p>
+          <w:p>
+            <w:pPr>
+              <w:numPr>
+                <w:ilvl w:val="0"/>
+                <w:numId w:val="2"/>
+              </w:numPr>
+              <w:spacing w:after="160" w:line="259" w:lineRule="auto"/>
+              <w:rPr>
+                <w:lang w:val="pt-PT"/>
+              </w:rPr>
+            </w:pPr>
+            <w:r>
+              <w:rPr>
+                <w:lang w:val="pt-PT"/>
+              </w:rPr>
+              <w:t>É necessário associar um animal, ou detalhes de um, para a consulta;</w:t>
+            </w:r>
+          </w:p>
+          <w:p>
+            <w:pPr>
+              <w:numPr>
+                <w:ilvl w:val="0"/>
+                <w:numId w:val="2"/>
+              </w:numPr>
+              <w:spacing w:after="160" w:line="259" w:lineRule="auto"/>
+              <w:rPr>
+                <w:lang w:val="pt-PT"/>
+              </w:rPr>
+            </w:pPr>
+            <w:r>
+              <w:rPr>
+                <w:lang w:val="pt-PT"/>
+              </w:rPr>
+              <w:t>É necessário escolher um horário disponível para a consulta;</w:t>
+            </w:r>
           </w:p>
         </w:tc>
       </w:tr>
@@ -7730,6 +7072,12 @@
               </w:rPr>
               <w:t>Título: US</w:t>
             </w:r>
+            <w:r>
+              <w:rPr>
+                <w:lang w:val="pt-PT"/>
+              </w:rPr>
+              <w:t>5 – Consultas pendentes</w:t>
+            </w:r>
           </w:p>
         </w:tc>
         <w:tc>
@@ -7757,6 +7105,18 @@
                 <w:lang w:val="pt-PT"/>
               </w:rPr>
               <w:t>:</w:t>
+            </w:r>
+            <w:r>
+              <w:rPr>
+                <w:lang w:val="pt-PT"/>
+              </w:rPr>
+              <w:t xml:space="preserve"> </w:t>
+            </w:r>
+            <w:r>
+              <w:rPr>
+                <w:lang w:val="pt-PT"/>
+              </w:rPr>
+              <w:t>3</w:t>
             </w:r>
           </w:p>
         </w:tc>
@@ -7780,6 +7140,12 @@
                 <w:lang w:val="pt-PT"/>
               </w:rPr>
               <w:t>Descrição:</w:t>
+            </w:r>
+            <w:r>
+              <w:rPr>
+                <w:lang w:val="pt-PT"/>
+              </w:rPr>
+              <w:t xml:space="preserve"> Como funcionário quero poder visualizar as consultas que tenho pendentes para o dia.</w:t>
             </w:r>
           </w:p>
           <w:p>
@@ -7807,6 +7173,30 @@
                 <w:lang w:val="pt-PT"/>
               </w:rPr>
             </w:pPr>
+            <w:r>
+              <w:rPr>
+                <w:lang w:val="pt-PT"/>
+              </w:rPr>
+              <w:t>É necessário estar autenticado na conta respetiva;</w:t>
+            </w:r>
+          </w:p>
+          <w:p>
+            <w:pPr>
+              <w:pStyle w:val="PargrafodaLista"/>
+              <w:numPr>
+                <w:ilvl w:val="0"/>
+                <w:numId w:val="2"/>
+              </w:numPr>
+              <w:rPr>
+                <w:lang w:val="pt-PT"/>
+              </w:rPr>
+            </w:pPr>
+            <w:r>
+              <w:rPr>
+                <w:lang w:val="pt-PT"/>
+              </w:rPr>
+              <w:t>É necessário ter consultas pendentes/marcadas;</w:t>
+            </w:r>
           </w:p>
         </w:tc>
       </w:tr>
@@ -7830,7 +7220,7 @@
               <w:rPr>
                 <w:lang w:val="pt-PT"/>
               </w:rPr>
-              <w:t>Título: US</w:t>
+              <w:t>Título: US6 – Cancelar adoção</w:t>
             </w:r>
           </w:p>
         </w:tc>
@@ -7858,7 +7248,13 @@
               <w:rPr>
                 <w:lang w:val="pt-PT"/>
               </w:rPr>
-              <w:t>:</w:t>
+              <w:t xml:space="preserve">: </w:t>
+            </w:r>
+            <w:r>
+              <w:rPr>
+                <w:lang w:val="pt-PT"/>
+              </w:rPr>
+              <w:t>1</w:t>
             </w:r>
           </w:p>
         </w:tc>
@@ -7867,26 +7263,31 @@
         <w:tc>
           <w:tcPr>
             <w:cnfStyle w:val="001000000000" w:firstRow="0" w:lastRow="0" w:firstColumn="1" w:lastColumn="0" w:oddVBand="0" w:evenVBand="0" w:oddHBand="0" w:evenHBand="0" w:firstRowFirstColumn="0" w:firstRowLastColumn="0" w:lastRowFirstColumn="0" w:lastRowLastColumn="0"/>
-            <w:tcW w:w="8647" w:type="dxa"/>
-          </w:tcPr>
-          <w:p>
-            <w:pPr>
-              <w:spacing w:after="160"/>
-              <w:rPr>
-                <w:lang w:val="pt-PT"/>
-              </w:rPr>
-            </w:pPr>
-            <w:r>
-              <w:rPr>
-                <w:lang w:val="pt-PT"/>
-              </w:rPr>
-              <w:t>Descrição:</w:t>
-            </w:r>
-          </w:p>
-          <w:p>
-            <w:pPr>
-              <w:spacing w:after="160"/>
-              <w:rPr>
+            <w:tcW w:w="9639" w:type="dxa"/>
+            <w:gridSpan w:val="2"/>
+          </w:tcPr>
+          <w:p>
+            <w:pPr>
+              <w:spacing w:after="160"/>
+              <w:rPr>
+                <w:b w:val="0"/>
+                <w:bCs w:val="0"/>
+                <w:lang w:val="pt-PT"/>
+              </w:rPr>
+            </w:pPr>
+            <w:r>
+              <w:rPr>
+                <w:lang w:val="pt-PT"/>
+              </w:rPr>
+              <w:t>Descrição: Como utilizador quero poder cancelar ou reverter adoções no caso de necessidade.</w:t>
+            </w:r>
+          </w:p>
+          <w:p>
+            <w:pPr>
+              <w:spacing w:after="160"/>
+              <w:rPr>
+                <w:b w:val="0"/>
+                <w:bCs w:val="0"/>
                 <w:lang w:val="pt-PT"/>
               </w:rPr>
             </w:pPr>
@@ -7899,29 +7300,21 @@
           </w:p>
           <w:p>
             <w:pPr>
+              <w:pStyle w:val="PargrafodaLista"/>
               <w:numPr>
                 <w:ilvl w:val="0"/>
-                <w:numId w:val="2"/>
+                <w:numId w:val="9"/>
               </w:numPr>
-              <w:spacing w:after="160" w:line="259" w:lineRule="auto"/>
-              <w:rPr>
-                <w:lang w:val="pt-PT"/>
-              </w:rPr>
-            </w:pPr>
-          </w:p>
-        </w:tc>
-        <w:tc>
-          <w:tcPr>
-            <w:tcW w:w="992" w:type="dxa"/>
-          </w:tcPr>
-          <w:p>
-            <w:pPr>
-              <w:spacing w:after="160"/>
-              <w:cnfStyle w:val="000000000000" w:firstRow="0" w:lastRow="0" w:firstColumn="0" w:lastColumn="0" w:oddVBand="0" w:evenVBand="0" w:oddHBand="0" w:evenHBand="0" w:firstRowFirstColumn="0" w:firstRowLastColumn="0" w:lastRowFirstColumn="0" w:lastRowLastColumn="0"/>
-              <w:rPr>
-                <w:lang w:val="pt-PT"/>
-              </w:rPr>
-            </w:pPr>
+              <w:rPr>
+                <w:lang w:val="pt-PT"/>
+              </w:rPr>
+            </w:pPr>
+            <w:r>
+              <w:rPr>
+                <w:lang w:val="pt-PT"/>
+              </w:rPr>
+              <w:t>É necessário estar autenticado na conta em que foi iniciado ou aceite o processo de adoção;</w:t>
+            </w:r>
           </w:p>
         </w:tc>
       </w:tr>
@@ -7936,11 +7329,16 @@
           </w:tcPr>
           <w:p>
             <w:pPr>
-              <w:spacing w:after="160"/>
-              <w:rPr>
-                <w:lang w:val="pt-PT"/>
-              </w:rPr>
-            </w:pPr>
+              <w:rPr>
+                <w:lang w:val="pt-PT"/>
+              </w:rPr>
+            </w:pPr>
+            <w:r>
+              <w:rPr>
+                <w:lang w:val="pt-PT"/>
+              </w:rPr>
+              <w:t>Título US7 – Doações</w:t>
+            </w:r>
           </w:p>
         </w:tc>
         <w:tc>
@@ -7949,12 +7347,31 @@
           </w:tcPr>
           <w:p>
             <w:pPr>
-              <w:spacing w:after="160"/>
-              <w:cnfStyle w:val="000000100000" w:firstRow="0" w:lastRow="0" w:firstColumn="0" w:lastColumn="0" w:oddVBand="0" w:evenVBand="0" w:oddHBand="1" w:evenHBand="0" w:firstRowFirstColumn="0" w:firstRowLastColumn="0" w:lastRowFirstColumn="0" w:lastRowLastColumn="0"/>
-              <w:rPr>
-                <w:lang w:val="pt-PT"/>
-              </w:rPr>
-            </w:pPr>
+              <w:cnfStyle w:val="000000100000" w:firstRow="0" w:lastRow="0" w:firstColumn="0" w:lastColumn="0" w:oddVBand="0" w:evenVBand="0" w:oddHBand="1" w:evenHBand="0" w:firstRowFirstColumn="0" w:firstRowLastColumn="0" w:lastRowFirstColumn="0" w:lastRowLastColumn="0"/>
+              <w:rPr>
+                <w:lang w:val="pt-PT"/>
+              </w:rPr>
+            </w:pPr>
+            <w:r>
+              <w:rPr>
+                <w:b/>
+                <w:bCs/>
+                <w:lang w:val="pt-PT"/>
+              </w:rPr>
+              <w:t>SP</w:t>
+            </w:r>
+            <w:r>
+              <w:rPr>
+                <w:lang w:val="pt-PT"/>
+              </w:rPr>
+              <w:t xml:space="preserve">: </w:t>
+            </w:r>
+            <w:r>
+              <w:rPr>
+                <w:lang w:val="pt-PT"/>
+              </w:rPr>
+              <w:t>3</w:t>
+            </w:r>
           </w:p>
         </w:tc>
       </w:tr>
@@ -7962,15 +7379,110 @@
         <w:tc>
           <w:tcPr>
             <w:cnfStyle w:val="001000000000" w:firstRow="0" w:lastRow="0" w:firstColumn="1" w:lastColumn="0" w:oddVBand="0" w:evenVBand="0" w:oddHBand="0" w:evenHBand="0" w:firstRowFirstColumn="0" w:firstRowLastColumn="0" w:lastRowFirstColumn="0" w:lastRowLastColumn="0"/>
+            <w:tcW w:w="9639" w:type="dxa"/>
+            <w:gridSpan w:val="2"/>
+          </w:tcPr>
+          <w:p>
+            <w:pPr>
+              <w:rPr>
+                <w:b w:val="0"/>
+                <w:bCs w:val="0"/>
+                <w:lang w:val="pt-PT"/>
+              </w:rPr>
+            </w:pPr>
+            <w:r>
+              <w:rPr>
+                <w:lang w:val="pt-PT"/>
+              </w:rPr>
+              <w:t>Descrição: Como visitante ou utilizador quero poder doar para o abrigo para que este cresça.</w:t>
+            </w:r>
+          </w:p>
+          <w:p>
+            <w:pPr>
+              <w:rPr>
+                <w:b w:val="0"/>
+                <w:bCs w:val="0"/>
+                <w:lang w:val="pt-PT"/>
+              </w:rPr>
+            </w:pPr>
+            <w:r>
+              <w:rPr>
+                <w:lang w:val="pt-PT"/>
+              </w:rPr>
+              <w:t>Critérios de Aceitação:</w:t>
+            </w:r>
+          </w:p>
+          <w:p>
+            <w:pPr>
+              <w:pStyle w:val="PargrafodaLista"/>
+              <w:numPr>
+                <w:ilvl w:val="0"/>
+                <w:numId w:val="10"/>
+              </w:numPr>
+              <w:rPr>
+                <w:lang w:val="pt-PT"/>
+              </w:rPr>
+            </w:pPr>
+            <w:r>
+              <w:rPr>
+                <w:lang w:val="pt-PT"/>
+              </w:rPr>
+              <w:t>É necessário inserir um valor monetário;</w:t>
+            </w:r>
+          </w:p>
+          <w:p>
+            <w:pPr>
+              <w:pStyle w:val="PargrafodaLista"/>
+              <w:numPr>
+                <w:ilvl w:val="0"/>
+                <w:numId w:val="10"/>
+              </w:numPr>
+              <w:rPr>
+                <w:lang w:val="pt-PT"/>
+              </w:rPr>
+            </w:pPr>
+            <w:r>
+              <w:rPr>
+                <w:lang w:val="pt-PT"/>
+              </w:rPr>
+              <w:t xml:space="preserve">É necessário inserir um NIF, no caso de utilizador </w:t>
+            </w:r>
+            <w:r>
+              <w:rPr>
+                <w:lang w:val="pt-PT"/>
+              </w:rPr>
+              <w:t xml:space="preserve">este </w:t>
+            </w:r>
+            <w:r>
+              <w:rPr>
+                <w:lang w:val="pt-PT"/>
+              </w:rPr>
+              <w:t>pode ser inserido automaticamente;</w:t>
+            </w:r>
+          </w:p>
+        </w:tc>
+      </w:tr>
+      <w:tr>
+        <w:trPr>
+          <w:cnfStyle w:val="000000100000" w:firstRow="0" w:lastRow="0" w:firstColumn="0" w:lastColumn="0" w:oddVBand="0" w:evenVBand="0" w:oddHBand="1" w:evenHBand="0" w:firstRowFirstColumn="0" w:firstRowLastColumn="0" w:lastRowFirstColumn="0" w:lastRowLastColumn="0"/>
+        </w:trPr>
+        <w:tc>
+          <w:tcPr>
+            <w:cnfStyle w:val="001000000000" w:firstRow="0" w:lastRow="0" w:firstColumn="1" w:lastColumn="0" w:oddVBand="0" w:evenVBand="0" w:oddHBand="0" w:evenHBand="0" w:firstRowFirstColumn="0" w:firstRowLastColumn="0" w:lastRowFirstColumn="0" w:lastRowLastColumn="0"/>
             <w:tcW w:w="8647" w:type="dxa"/>
           </w:tcPr>
           <w:p>
             <w:pPr>
-              <w:spacing w:after="160"/>
-              <w:rPr>
-                <w:lang w:val="pt-PT"/>
-              </w:rPr>
-            </w:pPr>
+              <w:rPr>
+                <w:lang w:val="pt-PT"/>
+              </w:rPr>
+            </w:pPr>
+            <w:r>
+              <w:rPr>
+                <w:lang w:val="pt-PT"/>
+              </w:rPr>
+              <w:t>Título US8 – Verificação de dados</w:t>
+            </w:r>
           </w:p>
         </w:tc>
         <w:tc>
@@ -7979,12 +7491,99 @@
           </w:tcPr>
           <w:p>
             <w:pPr>
-              <w:spacing w:after="160"/>
-              <w:cnfStyle w:val="000000000000" w:firstRow="0" w:lastRow="0" w:firstColumn="0" w:lastColumn="0" w:oddVBand="0" w:evenVBand="0" w:oddHBand="0" w:evenHBand="0" w:firstRowFirstColumn="0" w:firstRowLastColumn="0" w:lastRowFirstColumn="0" w:lastRowLastColumn="0"/>
-              <w:rPr>
-                <w:lang w:val="pt-PT"/>
-              </w:rPr>
-            </w:pPr>
+              <w:cnfStyle w:val="000000100000" w:firstRow="0" w:lastRow="0" w:firstColumn="0" w:lastColumn="0" w:oddVBand="0" w:evenVBand="0" w:oddHBand="1" w:evenHBand="0" w:firstRowFirstColumn="0" w:firstRowLastColumn="0" w:lastRowFirstColumn="0" w:lastRowLastColumn="0"/>
+              <w:rPr>
+                <w:lang w:val="pt-PT"/>
+              </w:rPr>
+            </w:pPr>
+            <w:r>
+              <w:rPr>
+                <w:b/>
+                <w:bCs/>
+                <w:lang w:val="pt-PT"/>
+              </w:rPr>
+              <w:t>SP</w:t>
+            </w:r>
+            <w:r>
+              <w:rPr>
+                <w:lang w:val="pt-PT"/>
+              </w:rPr>
+              <w:t>:</w:t>
+            </w:r>
+            <w:r>
+              <w:rPr>
+                <w:lang w:val="pt-PT"/>
+              </w:rPr>
+              <w:t xml:space="preserve"> 5</w:t>
+            </w:r>
+          </w:p>
+        </w:tc>
+      </w:tr>
+      <w:tr>
+        <w:tc>
+          <w:tcPr>
+            <w:cnfStyle w:val="001000000000" w:firstRow="0" w:lastRow="0" w:firstColumn="1" w:lastColumn="0" w:oddVBand="0" w:evenVBand="0" w:oddHBand="0" w:evenHBand="0" w:firstRowFirstColumn="0" w:firstRowLastColumn="0" w:lastRowFirstColumn="0" w:lastRowLastColumn="0"/>
+            <w:tcW w:w="9639" w:type="dxa"/>
+            <w:gridSpan w:val="2"/>
+          </w:tcPr>
+          <w:p>
+            <w:pPr>
+              <w:rPr>
+                <w:b w:val="0"/>
+                <w:bCs w:val="0"/>
+                <w:lang w:val="pt-PT"/>
+              </w:rPr>
+            </w:pPr>
+            <w:r>
+              <w:rPr>
+                <w:lang w:val="pt-PT"/>
+              </w:rPr>
+              <w:t>Descrição: Como utilizador quero poder verificar os dados dos meus animais:</w:t>
+            </w:r>
+          </w:p>
+          <w:p>
+            <w:pPr>
+              <w:pStyle w:val="PargrafodaLista"/>
+              <w:numPr>
+                <w:ilvl w:val="0"/>
+                <w:numId w:val="11"/>
+              </w:numPr>
+              <w:rPr>
+                <w:lang w:val="pt-PT"/>
+              </w:rPr>
+            </w:pPr>
+            <w:proofErr w:type="gramStart"/>
+            <w:r>
+              <w:rPr>
+                <w:lang w:val="pt-PT"/>
+              </w:rPr>
+              <w:t>O meu animal têm</w:t>
+            </w:r>
+            <w:proofErr w:type="gramEnd"/>
+            <w:r>
+              <w:rPr>
+                <w:lang w:val="pt-PT"/>
+              </w:rPr>
+              <w:t xml:space="preserve"> de estar registado no abrigo por ter sido adotado aqui ou registado posteriormente através de consultas;</w:t>
+            </w:r>
+          </w:p>
+          <w:p>
+            <w:pPr>
+              <w:pStyle w:val="PargrafodaLista"/>
+              <w:numPr>
+                <w:ilvl w:val="0"/>
+                <w:numId w:val="11"/>
+              </w:numPr>
+              <w:rPr>
+                <w:lang w:val="pt-PT"/>
+              </w:rPr>
+            </w:pPr>
+            <w:r>
+              <w:rPr>
+                <w:lang w:val="pt-PT"/>
+              </w:rPr>
+              <w:t>Tenho de estar autenticado numa conta que tenha o animal correspondente associado;</w:t>
+            </w:r>
           </w:p>
         </w:tc>
       </w:tr>
@@ -8010,7 +7609,7 @@
 </file>
 
 <file path=word/endnotes.xml><?xml version="1.0" encoding="utf-8"?>
-<w:endnotes xmlns:wpc="http://schemas.microsoft.com/office/word/2010/wordprocessingCanvas" xmlns:cx="http://schemas.microsoft.com/office/drawing/2014/chartex" xmlns:cx1="http://schemas.microsoft.com/office/drawing/2015/9/8/chartex" xmlns:cx2="http://schemas.microsoft.com/office/drawing/2015/10/21/chartex" xmlns:cx3="http://schemas.microsoft.com/office/drawing/2016/5/9/chartex" xmlns:cx4="http://schemas.microsoft.com/office/drawing/2016/5/10/chartex" xmlns:cx5="http://schemas.microsoft.com/office/drawing/2016/5/11/chartex" xmlns:cx6="http://schemas.microsoft.com/office/drawing/2016/5/12/chartex" xmlns:cx7="http://schemas.microsoft.com/office/drawing/2016/5/13/chartex" xmlns:cx8="http://schemas.microsoft.com/office/drawing/2016/5/14/chartex" xmlns:mc="http://schemas.openxmlformats.org/markup-compatibility/2006" xmlns:aink="http://schemas.microsoft.com/office/drawing/2016/ink" xmlns:am3d="http://schemas.microsoft.com/office/drawing/2017/model3d" xmlns:o="urn:schemas-microsoft-com:office:office" xmlns:oel="http://schemas.microsoft.com/office/2019/extlst" xmlns:r="http://schemas.openxmlformats.org/officeDocument/2006/relationships" xmlns:m="http://schemas.openxmlformats.org/officeDocument/2006/math" xmlns:v="urn:schemas-microsoft-com:vml" xmlns:wp14="http://schemas.microsoft.com/office/word/2010/wordprocessingDrawing" xmlns:wp="http://schemas.openxmlformats.org/drawingml/2006/wordprocessingDrawing" xmlns:w10="urn:schemas-microsoft-com:office:word" xmlns:w="http://schemas.openxmlformats.org/wordprocessingml/2006/main" xmlns:w14="http://schemas.microsoft.com/office/word/2010/wordml" xmlns:w15="http://schemas.microsoft.com/office/word/2012/wordml" xmlns:w16cex="http://schemas.microsoft.com/office/word/2018/wordml/cex" xmlns:w16cid="http://schemas.microsoft.com/office/word/2016/wordml/cid" xmlns:w16="http://schemas.microsoft.com/office/word/2018/wordml" xmlns:w16sdtdh="http://schemas.microsoft.com/office/word/2020/wordml/sdtdatahash" xmlns:w16se="http://schemas.microsoft.com/office/word/2015/wordml/symex" xmlns:wpg="http://schemas.microsoft.com/office/word/2010/wordprocessingGroup" xmlns:wpi="http://schemas.microsoft.com/office/word/2010/wordprocessingInk" xmlns:wne="http://schemas.microsoft.com/office/word/2006/wordml" xmlns:wps="http://schemas.microsoft.com/office/word/2010/wordprocessingShape" mc:Ignorable="w14 w15 w16se w16cid w16 w16cex w16sdtdh wp14">
+<w:endnotes xmlns:wpc="http://schemas.microsoft.com/office/word/2010/wordprocessingCanvas" xmlns:cx="http://schemas.microsoft.com/office/drawing/2014/chartex" xmlns:cx1="http://schemas.microsoft.com/office/drawing/2015/9/8/chartex" xmlns:cx2="http://schemas.microsoft.com/office/drawing/2015/10/21/chartex" xmlns:cx3="http://schemas.microsoft.com/office/drawing/2016/5/9/chartex" xmlns:cx4="http://schemas.microsoft.com/office/drawing/2016/5/10/chartex" xmlns:cx5="http://schemas.microsoft.com/office/drawing/2016/5/11/chartex" xmlns:cx6="http://schemas.microsoft.com/office/drawing/2016/5/12/chartex" xmlns:cx7="http://schemas.microsoft.com/office/drawing/2016/5/13/chartex" xmlns:cx8="http://schemas.microsoft.com/office/drawing/2016/5/14/chartex" xmlns:mc="http://schemas.openxmlformats.org/markup-compatibility/2006" xmlns:aink="http://schemas.microsoft.com/office/drawing/2016/ink" xmlns:am3d="http://schemas.microsoft.com/office/drawing/2017/model3d" xmlns:o="urn:schemas-microsoft-com:office:office" xmlns:oel="http://schemas.microsoft.com/office/2019/extlst" xmlns:r="http://schemas.openxmlformats.org/officeDocument/2006/relationships" xmlns:m="http://schemas.openxmlformats.org/officeDocument/2006/math" xmlns:v="urn:schemas-microsoft-com:vml" xmlns:wp14="http://schemas.microsoft.com/office/word/2010/wordprocessingDrawing" xmlns:wp="http://schemas.openxmlformats.org/drawingml/2006/wordprocessingDrawing" xmlns:w10="urn:schemas-microsoft-com:office:word" xmlns:w="http://schemas.openxmlformats.org/wordprocessingml/2006/main" xmlns:w14="http://schemas.microsoft.com/office/word/2010/wordml" xmlns:w15="http://schemas.microsoft.com/office/word/2012/wordml" xmlns:w16cex="http://schemas.microsoft.com/office/word/2018/wordml/cex" xmlns:w16cid="http://schemas.microsoft.com/office/word/2016/wordml/cid" xmlns:w16="http://schemas.microsoft.com/office/word/2018/wordml" xmlns:w16du="http://schemas.microsoft.com/office/word/2023/wordml/word16du" xmlns:w16sdtdh="http://schemas.microsoft.com/office/word/2020/wordml/sdtdatahash" xmlns:w16sdtfl="http://schemas.microsoft.com/office/word/2024/wordml/sdtformatlock" xmlns:w16se="http://schemas.microsoft.com/office/word/2015/wordml/symex" xmlns:wpg="http://schemas.microsoft.com/office/word/2010/wordprocessingGroup" xmlns:wpi="http://schemas.microsoft.com/office/word/2010/wordprocessingInk" xmlns:wne="http://schemas.microsoft.com/office/word/2006/wordml" xmlns:wps="http://schemas.microsoft.com/office/word/2010/wordprocessingShape" mc:Ignorable="w14 w15 w16se w16cid w16 w16cex w16sdtdh w16sdtfl w16du wp14">
   <w:endnote w:type="separator" w:id="-1">
     <w:p>
       <w:pPr>
@@ -8035,7 +7634,7 @@
 </file>
 
 <file path=word/footer1.xml><?xml version="1.0" encoding="utf-8"?>
-<w:ftr xmlns:wpc="http://schemas.microsoft.com/office/word/2010/wordprocessingCanvas" xmlns:cx="http://schemas.microsoft.com/office/drawing/2014/chartex" xmlns:cx1="http://schemas.microsoft.com/office/drawing/2015/9/8/chartex" xmlns:cx2="http://schemas.microsoft.com/office/drawing/2015/10/21/chartex" xmlns:cx3="http://schemas.microsoft.com/office/drawing/2016/5/9/chartex" xmlns:cx4="http://schemas.microsoft.com/office/drawing/2016/5/10/chartex" xmlns:cx5="http://schemas.microsoft.com/office/drawing/2016/5/11/chartex" xmlns:cx6="http://schemas.microsoft.com/office/drawing/2016/5/12/chartex" xmlns:cx7="http://schemas.microsoft.com/office/drawing/2016/5/13/chartex" xmlns:cx8="http://schemas.microsoft.com/office/drawing/2016/5/14/chartex" xmlns:mc="http://schemas.openxmlformats.org/markup-compatibility/2006" xmlns:aink="http://schemas.microsoft.com/office/drawing/2016/ink" xmlns:am3d="http://schemas.microsoft.com/office/drawing/2017/model3d" xmlns:o="urn:schemas-microsoft-com:office:office" xmlns:oel="http://schemas.microsoft.com/office/2019/extlst" xmlns:r="http://schemas.openxmlformats.org/officeDocument/2006/relationships" xmlns:m="http://schemas.openxmlformats.org/officeDocument/2006/math" xmlns:v="urn:schemas-microsoft-com:vml" xmlns:wp14="http://schemas.microsoft.com/office/word/2010/wordprocessingDrawing" xmlns:wp="http://schemas.openxmlformats.org/drawingml/2006/wordprocessingDrawing" xmlns:w10="urn:schemas-microsoft-com:office:word" xmlns:w="http://schemas.openxmlformats.org/wordprocessingml/2006/main" xmlns:w14="http://schemas.microsoft.com/office/word/2010/wordml" xmlns:w15="http://schemas.microsoft.com/office/word/2012/wordml" xmlns:w16cex="http://schemas.microsoft.com/office/word/2018/wordml/cex" xmlns:w16cid="http://schemas.microsoft.com/office/word/2016/wordml/cid" xmlns:w16="http://schemas.microsoft.com/office/word/2018/wordml" xmlns:w16sdtdh="http://schemas.microsoft.com/office/word/2020/wordml/sdtdatahash" xmlns:w16se="http://schemas.microsoft.com/office/word/2015/wordml/symex" xmlns:wpg="http://schemas.microsoft.com/office/word/2010/wordprocessingGroup" xmlns:wpi="http://schemas.microsoft.com/office/word/2010/wordprocessingInk" xmlns:wne="http://schemas.microsoft.com/office/word/2006/wordml" xmlns:wps="http://schemas.microsoft.com/office/word/2010/wordprocessingShape" mc:Ignorable="w14 w15 w16se w16cid w16 w16cex w16sdtdh wp14">
+<w:ftr xmlns:wpc="http://schemas.microsoft.com/office/word/2010/wordprocessingCanvas" xmlns:cx="http://schemas.microsoft.com/office/drawing/2014/chartex" xmlns:cx1="http://schemas.microsoft.com/office/drawing/2015/9/8/chartex" xmlns:cx2="http://schemas.microsoft.com/office/drawing/2015/10/21/chartex" xmlns:cx3="http://schemas.microsoft.com/office/drawing/2016/5/9/chartex" xmlns:cx4="http://schemas.microsoft.com/office/drawing/2016/5/10/chartex" xmlns:cx5="http://schemas.microsoft.com/office/drawing/2016/5/11/chartex" xmlns:cx6="http://schemas.microsoft.com/office/drawing/2016/5/12/chartex" xmlns:cx7="http://schemas.microsoft.com/office/drawing/2016/5/13/chartex" xmlns:cx8="http://schemas.microsoft.com/office/drawing/2016/5/14/chartex" xmlns:mc="http://schemas.openxmlformats.org/markup-compatibility/2006" xmlns:aink="http://schemas.microsoft.com/office/drawing/2016/ink" xmlns:am3d="http://schemas.microsoft.com/office/drawing/2017/model3d" xmlns:o="urn:schemas-microsoft-com:office:office" xmlns:oel="http://schemas.microsoft.com/office/2019/extlst" xmlns:r="http://schemas.openxmlformats.org/officeDocument/2006/relationships" xmlns:m="http://schemas.openxmlformats.org/officeDocument/2006/math" xmlns:v="urn:schemas-microsoft-com:vml" xmlns:wp14="http://schemas.microsoft.com/office/word/2010/wordprocessingDrawing" xmlns:wp="http://schemas.openxmlformats.org/drawingml/2006/wordprocessingDrawing" xmlns:w10="urn:schemas-microsoft-com:office:word" xmlns:w="http://schemas.openxmlformats.org/wordprocessingml/2006/main" xmlns:w14="http://schemas.microsoft.com/office/word/2010/wordml" xmlns:w15="http://schemas.microsoft.com/office/word/2012/wordml" xmlns:w16cex="http://schemas.microsoft.com/office/word/2018/wordml/cex" xmlns:w16cid="http://schemas.microsoft.com/office/word/2016/wordml/cid" xmlns:w16="http://schemas.microsoft.com/office/word/2018/wordml" xmlns:w16du="http://schemas.microsoft.com/office/word/2023/wordml/word16du" xmlns:w16sdtdh="http://schemas.microsoft.com/office/word/2020/wordml/sdtdatahash" xmlns:w16sdtfl="http://schemas.microsoft.com/office/word/2024/wordml/sdtformatlock" xmlns:w16se="http://schemas.microsoft.com/office/word/2015/wordml/symex" xmlns:wpg="http://schemas.microsoft.com/office/word/2010/wordprocessingGroup" xmlns:wpi="http://schemas.microsoft.com/office/word/2010/wordprocessingInk" xmlns:wne="http://schemas.microsoft.com/office/word/2006/wordml" xmlns:wps="http://schemas.microsoft.com/office/word/2010/wordprocessingShape" mc:Ignorable="w14 w15 w16se w16cid w16 w16cex w16sdtdh w16sdtfl w16du wp14">
   <w:sdt>
     <w:sdtPr>
       <w:id w:val="2071930181"/>
@@ -8047,7 +7646,7 @@
     <w:sdtContent>
       <w:p>
         <w:pPr>
-          <w:pStyle w:val="Footer"/>
+          <w:pStyle w:val="Rodap"/>
         </w:pPr>
         <w:r>
           <w:rPr>
@@ -8218,7 +7817,7 @@
 </file>
 
 <file path=word/footnotes.xml><?xml version="1.0" encoding="utf-8"?>
-<w:footnotes xmlns:wpc="http://schemas.microsoft.com/office/word/2010/wordprocessingCanvas" xmlns:cx="http://schemas.microsoft.com/office/drawing/2014/chartex" xmlns:cx1="http://schemas.microsoft.com/office/drawing/2015/9/8/chartex" xmlns:cx2="http://schemas.microsoft.com/office/drawing/2015/10/21/chartex" xmlns:cx3="http://schemas.microsoft.com/office/drawing/2016/5/9/chartex" xmlns:cx4="http://schemas.microsoft.com/office/drawing/2016/5/10/chartex" xmlns:cx5="http://schemas.microsoft.com/office/drawing/2016/5/11/chartex" xmlns:cx6="http://schemas.microsoft.com/office/drawing/2016/5/12/chartex" xmlns:cx7="http://schemas.microsoft.com/office/drawing/2016/5/13/chartex" xmlns:cx8="http://schemas.microsoft.com/office/drawing/2016/5/14/chartex" xmlns:mc="http://schemas.openxmlformats.org/markup-compatibility/2006" xmlns:aink="http://schemas.microsoft.com/office/drawing/2016/ink" xmlns:am3d="http://schemas.microsoft.com/office/drawing/2017/model3d" xmlns:o="urn:schemas-microsoft-com:office:office" xmlns:oel="http://schemas.microsoft.com/office/2019/extlst" xmlns:r="http://schemas.openxmlformats.org/officeDocument/2006/relationships" xmlns:m="http://schemas.openxmlformats.org/officeDocument/2006/math" xmlns:v="urn:schemas-microsoft-com:vml" xmlns:wp14="http://schemas.microsoft.com/office/word/2010/wordprocessingDrawing" xmlns:wp="http://schemas.openxmlformats.org/drawingml/2006/wordprocessingDrawing" xmlns:w10="urn:schemas-microsoft-com:office:word" xmlns:w="http://schemas.openxmlformats.org/wordprocessingml/2006/main" xmlns:w14="http://schemas.microsoft.com/office/word/2010/wordml" xmlns:w15="http://schemas.microsoft.com/office/word/2012/wordml" xmlns:w16cex="http://schemas.microsoft.com/office/word/2018/wordml/cex" xmlns:w16cid="http://schemas.microsoft.com/office/word/2016/wordml/cid" xmlns:w16="http://schemas.microsoft.com/office/word/2018/wordml" xmlns:w16sdtdh="http://schemas.microsoft.com/office/word/2020/wordml/sdtdatahash" xmlns:w16se="http://schemas.microsoft.com/office/word/2015/wordml/symex" xmlns:wpg="http://schemas.microsoft.com/office/word/2010/wordprocessingGroup" xmlns:wpi="http://schemas.microsoft.com/office/word/2010/wordprocessingInk" xmlns:wne="http://schemas.microsoft.com/office/word/2006/wordml" xmlns:wps="http://schemas.microsoft.com/office/word/2010/wordprocessingShape" mc:Ignorable="w14 w15 w16se w16cid w16 w16cex w16sdtdh wp14">
+<w:footnotes xmlns:wpc="http://schemas.microsoft.com/office/word/2010/wordprocessingCanvas" xmlns:cx="http://schemas.microsoft.com/office/drawing/2014/chartex" xmlns:cx1="http://schemas.microsoft.com/office/drawing/2015/9/8/chartex" xmlns:cx2="http://schemas.microsoft.com/office/drawing/2015/10/21/chartex" xmlns:cx3="http://schemas.microsoft.com/office/drawing/2016/5/9/chartex" xmlns:cx4="http://schemas.microsoft.com/office/drawing/2016/5/10/chartex" xmlns:cx5="http://schemas.microsoft.com/office/drawing/2016/5/11/chartex" xmlns:cx6="http://schemas.microsoft.com/office/drawing/2016/5/12/chartex" xmlns:cx7="http://schemas.microsoft.com/office/drawing/2016/5/13/chartex" xmlns:cx8="http://schemas.microsoft.com/office/drawing/2016/5/14/chartex" xmlns:mc="http://schemas.openxmlformats.org/markup-compatibility/2006" xmlns:aink="http://schemas.microsoft.com/office/drawing/2016/ink" xmlns:am3d="http://schemas.microsoft.com/office/drawing/2017/model3d" xmlns:o="urn:schemas-microsoft-com:office:office" xmlns:oel="http://schemas.microsoft.com/office/2019/extlst" xmlns:r="http://schemas.openxmlformats.org/officeDocument/2006/relationships" xmlns:m="http://schemas.openxmlformats.org/officeDocument/2006/math" xmlns:v="urn:schemas-microsoft-com:vml" xmlns:wp14="http://schemas.microsoft.com/office/word/2010/wordprocessingDrawing" xmlns:wp="http://schemas.openxmlformats.org/drawingml/2006/wordprocessingDrawing" xmlns:w10="urn:schemas-microsoft-com:office:word" xmlns:w="http://schemas.openxmlformats.org/wordprocessingml/2006/main" xmlns:w14="http://schemas.microsoft.com/office/word/2010/wordml" xmlns:w15="http://schemas.microsoft.com/office/word/2012/wordml" xmlns:w16cex="http://schemas.microsoft.com/office/word/2018/wordml/cex" xmlns:w16cid="http://schemas.microsoft.com/office/word/2016/wordml/cid" xmlns:w16="http://schemas.microsoft.com/office/word/2018/wordml" xmlns:w16du="http://schemas.microsoft.com/office/word/2023/wordml/word16du" xmlns:w16sdtdh="http://schemas.microsoft.com/office/word/2020/wordml/sdtdatahash" xmlns:w16sdtfl="http://schemas.microsoft.com/office/word/2024/wordml/sdtformatlock" xmlns:w16se="http://schemas.microsoft.com/office/word/2015/wordml/symex" xmlns:wpg="http://schemas.microsoft.com/office/word/2010/wordprocessingGroup" xmlns:wpi="http://schemas.microsoft.com/office/word/2010/wordprocessingInk" xmlns:wne="http://schemas.microsoft.com/office/word/2006/wordml" xmlns:wps="http://schemas.microsoft.com/office/word/2010/wordprocessingShape" mc:Ignorable="w14 w15 w16se w16cid w16 w16cex w16sdtdh w16sdtfl w16du wp14">
   <w:footnote w:type="separator" w:id="-1">
     <w:p>
       <w:pPr>
@@ -8243,21 +7842,21 @@
 </file>
 
 <file path=word/header1.xml><?xml version="1.0" encoding="utf-8"?>
-<w:hdr xmlns:wpc="http://schemas.microsoft.com/office/word/2010/wordprocessingCanvas" xmlns:cx="http://schemas.microsoft.com/office/drawing/2014/chartex" xmlns:cx1="http://schemas.microsoft.com/office/drawing/2015/9/8/chartex" xmlns:cx2="http://schemas.microsoft.com/office/drawing/2015/10/21/chartex" xmlns:cx3="http://schemas.microsoft.com/office/drawing/2016/5/9/chartex" xmlns:cx4="http://schemas.microsoft.com/office/drawing/2016/5/10/chartex" xmlns:cx5="http://schemas.microsoft.com/office/drawing/2016/5/11/chartex" xmlns:cx6="http://schemas.microsoft.com/office/drawing/2016/5/12/chartex" xmlns:cx7="http://schemas.microsoft.com/office/drawing/2016/5/13/chartex" xmlns:cx8="http://schemas.microsoft.com/office/drawing/2016/5/14/chartex" xmlns:mc="http://schemas.openxmlformats.org/markup-compatibility/2006" xmlns:aink="http://schemas.microsoft.com/office/drawing/2016/ink" xmlns:am3d="http://schemas.microsoft.com/office/drawing/2017/model3d" xmlns:o="urn:schemas-microsoft-com:office:office" xmlns:oel="http://schemas.microsoft.com/office/2019/extlst" xmlns:r="http://schemas.openxmlformats.org/officeDocument/2006/relationships" xmlns:m="http://schemas.openxmlformats.org/officeDocument/2006/math" xmlns:v="urn:schemas-microsoft-com:vml" xmlns:wp14="http://schemas.microsoft.com/office/word/2010/wordprocessingDrawing" xmlns:wp="http://schemas.openxmlformats.org/drawingml/2006/wordprocessingDrawing" xmlns:w10="urn:schemas-microsoft-com:office:word" xmlns:w="http://schemas.openxmlformats.org/wordprocessingml/2006/main" xmlns:w14="http://schemas.microsoft.com/office/word/2010/wordml" xmlns:w15="http://schemas.microsoft.com/office/word/2012/wordml" xmlns:w16cex="http://schemas.microsoft.com/office/word/2018/wordml/cex" xmlns:w16cid="http://schemas.microsoft.com/office/word/2016/wordml/cid" xmlns:w16="http://schemas.microsoft.com/office/word/2018/wordml" xmlns:w16sdtdh="http://schemas.microsoft.com/office/word/2020/wordml/sdtdatahash" xmlns:w16se="http://schemas.microsoft.com/office/word/2015/wordml/symex" xmlns:wpg="http://schemas.microsoft.com/office/word/2010/wordprocessingGroup" xmlns:wpi="http://schemas.microsoft.com/office/word/2010/wordprocessingInk" xmlns:wne="http://schemas.microsoft.com/office/word/2006/wordml" xmlns:wps="http://schemas.microsoft.com/office/word/2010/wordprocessingShape" mc:Ignorable="w14 w15 w16se w16cid w16 w16cex w16sdtdh wp14">
+<w:hdr xmlns:wpc="http://schemas.microsoft.com/office/word/2010/wordprocessingCanvas" xmlns:cx="http://schemas.microsoft.com/office/drawing/2014/chartex" xmlns:cx1="http://schemas.microsoft.com/office/drawing/2015/9/8/chartex" xmlns:cx2="http://schemas.microsoft.com/office/drawing/2015/10/21/chartex" xmlns:cx3="http://schemas.microsoft.com/office/drawing/2016/5/9/chartex" xmlns:cx4="http://schemas.microsoft.com/office/drawing/2016/5/10/chartex" xmlns:cx5="http://schemas.microsoft.com/office/drawing/2016/5/11/chartex" xmlns:cx6="http://schemas.microsoft.com/office/drawing/2016/5/12/chartex" xmlns:cx7="http://schemas.microsoft.com/office/drawing/2016/5/13/chartex" xmlns:cx8="http://schemas.microsoft.com/office/drawing/2016/5/14/chartex" xmlns:mc="http://schemas.openxmlformats.org/markup-compatibility/2006" xmlns:aink="http://schemas.microsoft.com/office/drawing/2016/ink" xmlns:am3d="http://schemas.microsoft.com/office/drawing/2017/model3d" xmlns:o="urn:schemas-microsoft-com:office:office" xmlns:oel="http://schemas.microsoft.com/office/2019/extlst" xmlns:r="http://schemas.openxmlformats.org/officeDocument/2006/relationships" xmlns:m="http://schemas.openxmlformats.org/officeDocument/2006/math" xmlns:v="urn:schemas-microsoft-com:vml" xmlns:wp14="http://schemas.microsoft.com/office/word/2010/wordprocessingDrawing" xmlns:wp="http://schemas.openxmlformats.org/drawingml/2006/wordprocessingDrawing" xmlns:w10="urn:schemas-microsoft-com:office:word" xmlns:w="http://schemas.openxmlformats.org/wordprocessingml/2006/main" xmlns:w14="http://schemas.microsoft.com/office/word/2010/wordml" xmlns:w15="http://schemas.microsoft.com/office/word/2012/wordml" xmlns:w16cex="http://schemas.microsoft.com/office/word/2018/wordml/cex" xmlns:w16cid="http://schemas.microsoft.com/office/word/2016/wordml/cid" xmlns:w16="http://schemas.microsoft.com/office/word/2018/wordml" xmlns:w16du="http://schemas.microsoft.com/office/word/2023/wordml/word16du" xmlns:w16sdtdh="http://schemas.microsoft.com/office/word/2020/wordml/sdtdatahash" xmlns:w16sdtfl="http://schemas.microsoft.com/office/word/2024/wordml/sdtformatlock" xmlns:w16se="http://schemas.microsoft.com/office/word/2015/wordml/symex" xmlns:wpg="http://schemas.microsoft.com/office/word/2010/wordprocessingGroup" xmlns:wpi="http://schemas.microsoft.com/office/word/2010/wordprocessingInk" xmlns:wne="http://schemas.microsoft.com/office/word/2006/wordml" xmlns:wps="http://schemas.microsoft.com/office/word/2010/wordprocessingShape" mc:Ignorable="w14 w15 w16se w16cid w16 w16cex w16sdtdh w16sdtfl w16du wp14">
   <w:p>
     <w:pPr>
-      <w:pStyle w:val="Header"/>
+      <w:pStyle w:val="Cabealho"/>
     </w:pPr>
   </w:p>
 </w:hdr>
 </file>
 
 <file path=word/numbering.xml><?xml version="1.0" encoding="utf-8"?>
-<w:numbering xmlns:wpc="http://schemas.microsoft.com/office/word/2010/wordprocessingCanvas" xmlns:cx="http://schemas.microsoft.com/office/drawing/2014/chartex" xmlns:cx1="http://schemas.microsoft.com/office/drawing/2015/9/8/chartex" xmlns:cx2="http://schemas.microsoft.com/office/drawing/2015/10/21/chartex" xmlns:cx3="http://schemas.microsoft.com/office/drawing/2016/5/9/chartex" xmlns:cx4="http://schemas.microsoft.com/office/drawing/2016/5/10/chartex" xmlns:cx5="http://schemas.microsoft.com/office/drawing/2016/5/11/chartex" xmlns:cx6="http://schemas.microsoft.com/office/drawing/2016/5/12/chartex" xmlns:cx7="http://schemas.microsoft.com/office/drawing/2016/5/13/chartex" xmlns:cx8="http://schemas.microsoft.com/office/drawing/2016/5/14/chartex" xmlns:mc="http://schemas.openxmlformats.org/markup-compatibility/2006" xmlns:aink="http://schemas.microsoft.com/office/drawing/2016/ink" xmlns:am3d="http://schemas.microsoft.com/office/drawing/2017/model3d" xmlns:o="urn:schemas-microsoft-com:office:office" xmlns:oel="http://schemas.microsoft.com/office/2019/extlst" xmlns:r="http://schemas.openxmlformats.org/officeDocument/2006/relationships" xmlns:m="http://schemas.openxmlformats.org/officeDocument/2006/math" xmlns:v="urn:schemas-microsoft-com:vml" xmlns:wp14="http://schemas.microsoft.com/office/word/2010/wordprocessingDrawing" xmlns:wp="http://schemas.openxmlformats.org/drawingml/2006/wordprocessingDrawing" xmlns:w10="urn:schemas-microsoft-com:office:word" xmlns:w="http://schemas.openxmlformats.org/wordprocessingml/2006/main" xmlns:w14="http://schemas.microsoft.com/office/word/2010/wordml" xmlns:w15="http://schemas.microsoft.com/office/word/2012/wordml" xmlns:w16cex="http://schemas.microsoft.com/office/word/2018/wordml/cex" xmlns:w16cid="http://schemas.microsoft.com/office/word/2016/wordml/cid" xmlns:w16="http://schemas.microsoft.com/office/word/2018/wordml" xmlns:w16sdtdh="http://schemas.microsoft.com/office/word/2020/wordml/sdtdatahash" xmlns:w16se="http://schemas.microsoft.com/office/word/2015/wordml/symex" xmlns:wpg="http://schemas.microsoft.com/office/word/2010/wordprocessingGroup" xmlns:wpi="http://schemas.microsoft.com/office/word/2010/wordprocessingInk" xmlns:wne="http://schemas.microsoft.com/office/word/2006/wordml" xmlns:wps="http://schemas.microsoft.com/office/word/2010/wordprocessingShape" mc:Ignorable="w14 w15 w16se w16cid w16 w16cex w16sdtdh wp14">
+<w:numbering xmlns:wpc="http://schemas.microsoft.com/office/word/2010/wordprocessingCanvas" xmlns:cx="http://schemas.microsoft.com/office/drawing/2014/chartex" xmlns:cx1="http://schemas.microsoft.com/office/drawing/2015/9/8/chartex" xmlns:cx2="http://schemas.microsoft.com/office/drawing/2015/10/21/chartex" xmlns:cx3="http://schemas.microsoft.com/office/drawing/2016/5/9/chartex" xmlns:cx4="http://schemas.microsoft.com/office/drawing/2016/5/10/chartex" xmlns:cx5="http://schemas.microsoft.com/office/drawing/2016/5/11/chartex" xmlns:cx6="http://schemas.microsoft.com/office/drawing/2016/5/12/chartex" xmlns:cx7="http://schemas.microsoft.com/office/drawing/2016/5/13/chartex" xmlns:cx8="http://schemas.microsoft.com/office/drawing/2016/5/14/chartex" xmlns:mc="http://schemas.openxmlformats.org/markup-compatibility/2006" xmlns:aink="http://schemas.microsoft.com/office/drawing/2016/ink" xmlns:am3d="http://schemas.microsoft.com/office/drawing/2017/model3d" xmlns:o="urn:schemas-microsoft-com:office:office" xmlns:oel="http://schemas.microsoft.com/office/2019/extlst" xmlns:r="http://schemas.openxmlformats.org/officeDocument/2006/relationships" xmlns:m="http://schemas.openxmlformats.org/officeDocument/2006/math" xmlns:v="urn:schemas-microsoft-com:vml" xmlns:wp14="http://schemas.microsoft.com/office/word/2010/wordprocessingDrawing" xmlns:wp="http://schemas.openxmlformats.org/drawingml/2006/wordprocessingDrawing" xmlns:w10="urn:schemas-microsoft-com:office:word" xmlns:w="http://schemas.openxmlformats.org/wordprocessingml/2006/main" xmlns:w14="http://schemas.microsoft.com/office/word/2010/wordml" xmlns:w15="http://schemas.microsoft.com/office/word/2012/wordml" xmlns:w16cex="http://schemas.microsoft.com/office/word/2018/wordml/cex" xmlns:w16cid="http://schemas.microsoft.com/office/word/2016/wordml/cid" xmlns:w16="http://schemas.microsoft.com/office/word/2018/wordml" xmlns:w16du="http://schemas.microsoft.com/office/word/2023/wordml/word16du" xmlns:w16sdtdh="http://schemas.microsoft.com/office/word/2020/wordml/sdtdatahash" xmlns:w16sdtfl="http://schemas.microsoft.com/office/word/2024/wordml/sdtformatlock" xmlns:w16se="http://schemas.microsoft.com/office/word/2015/wordml/symex" xmlns:wpg="http://schemas.microsoft.com/office/word/2010/wordprocessingGroup" xmlns:wpi="http://schemas.microsoft.com/office/word/2010/wordprocessingInk" xmlns:wne="http://schemas.microsoft.com/office/word/2006/wordml" xmlns:wps="http://schemas.microsoft.com/office/word/2010/wordprocessingShape" mc:Ignorable="w14 w15 w16se w16cid w16 w16cex w16sdtdh w16sdtfl w16du wp14">
   <w:abstractNum w:abstractNumId="0" w15:restartNumberingAfterBreak="0">
     <w:nsid w:val="1AF142CE"/>
     <w:multiLevelType w:val="hybridMultilevel"/>
-    <w:tmpl w:val="77486102"/>
+    <w:tmpl w:val="A99EA388"/>
     <w:lvl w:ilvl="0" w:tplc="08090001">
       <w:start w:val="1"/>
       <w:numFmt w:val="bullet"/>
@@ -8707,6 +8306,232 @@
     </w:lvl>
   </w:abstractNum>
   <w:abstractNum w:abstractNumId="4" w15:restartNumberingAfterBreak="0">
+    <w:nsid w:val="4E061276"/>
+    <w:multiLevelType w:val="hybridMultilevel"/>
+    <w:tmpl w:val="2C46ECA6"/>
+    <w:lvl w:ilvl="0" w:tplc="08090001">
+      <w:start w:val="1"/>
+      <w:numFmt w:val="bullet"/>
+      <w:lvlText w:val=""/>
+      <w:lvlJc w:val="left"/>
+      <w:pPr>
+        <w:ind w:left="720" w:hanging="360"/>
+      </w:pPr>
+      <w:rPr>
+        <w:rFonts w:ascii="Symbol" w:hAnsi="Symbol" w:hint="default"/>
+      </w:rPr>
+    </w:lvl>
+    <w:lvl w:ilvl="1" w:tplc="08160003" w:tentative="1">
+      <w:start w:val="1"/>
+      <w:numFmt w:val="bullet"/>
+      <w:lvlText w:val="o"/>
+      <w:lvlJc w:val="left"/>
+      <w:pPr>
+        <w:ind w:left="1440" w:hanging="360"/>
+      </w:pPr>
+      <w:rPr>
+        <w:rFonts w:ascii="Courier New" w:hAnsi="Courier New" w:cs="Courier New" w:hint="default"/>
+      </w:rPr>
+    </w:lvl>
+    <w:lvl w:ilvl="2" w:tplc="08160005" w:tentative="1">
+      <w:start w:val="1"/>
+      <w:numFmt w:val="bullet"/>
+      <w:lvlText w:val=""/>
+      <w:lvlJc w:val="left"/>
+      <w:pPr>
+        <w:ind w:left="2160" w:hanging="360"/>
+      </w:pPr>
+      <w:rPr>
+        <w:rFonts w:ascii="Wingdings" w:hAnsi="Wingdings" w:hint="default"/>
+      </w:rPr>
+    </w:lvl>
+    <w:lvl w:ilvl="3" w:tplc="08160001" w:tentative="1">
+      <w:start w:val="1"/>
+      <w:numFmt w:val="bullet"/>
+      <w:lvlText w:val=""/>
+      <w:lvlJc w:val="left"/>
+      <w:pPr>
+        <w:ind w:left="2880" w:hanging="360"/>
+      </w:pPr>
+      <w:rPr>
+        <w:rFonts w:ascii="Symbol" w:hAnsi="Symbol" w:hint="default"/>
+      </w:rPr>
+    </w:lvl>
+    <w:lvl w:ilvl="4" w:tplc="08160003" w:tentative="1">
+      <w:start w:val="1"/>
+      <w:numFmt w:val="bullet"/>
+      <w:lvlText w:val="o"/>
+      <w:lvlJc w:val="left"/>
+      <w:pPr>
+        <w:ind w:left="3600" w:hanging="360"/>
+      </w:pPr>
+      <w:rPr>
+        <w:rFonts w:ascii="Courier New" w:hAnsi="Courier New" w:cs="Courier New" w:hint="default"/>
+      </w:rPr>
+    </w:lvl>
+    <w:lvl w:ilvl="5" w:tplc="08160005" w:tentative="1">
+      <w:start w:val="1"/>
+      <w:numFmt w:val="bullet"/>
+      <w:lvlText w:val=""/>
+      <w:lvlJc w:val="left"/>
+      <w:pPr>
+        <w:ind w:left="4320" w:hanging="360"/>
+      </w:pPr>
+      <w:rPr>
+        <w:rFonts w:ascii="Wingdings" w:hAnsi="Wingdings" w:hint="default"/>
+      </w:rPr>
+    </w:lvl>
+    <w:lvl w:ilvl="6" w:tplc="08160001" w:tentative="1">
+      <w:start w:val="1"/>
+      <w:numFmt w:val="bullet"/>
+      <w:lvlText w:val=""/>
+      <w:lvlJc w:val="left"/>
+      <w:pPr>
+        <w:ind w:left="5040" w:hanging="360"/>
+      </w:pPr>
+      <w:rPr>
+        <w:rFonts w:ascii="Symbol" w:hAnsi="Symbol" w:hint="default"/>
+      </w:rPr>
+    </w:lvl>
+    <w:lvl w:ilvl="7" w:tplc="08160003" w:tentative="1">
+      <w:start w:val="1"/>
+      <w:numFmt w:val="bullet"/>
+      <w:lvlText w:val="o"/>
+      <w:lvlJc w:val="left"/>
+      <w:pPr>
+        <w:ind w:left="5760" w:hanging="360"/>
+      </w:pPr>
+      <w:rPr>
+        <w:rFonts w:ascii="Courier New" w:hAnsi="Courier New" w:cs="Courier New" w:hint="default"/>
+      </w:rPr>
+    </w:lvl>
+    <w:lvl w:ilvl="8" w:tplc="08160005" w:tentative="1">
+      <w:start w:val="1"/>
+      <w:numFmt w:val="bullet"/>
+      <w:lvlText w:val=""/>
+      <w:lvlJc w:val="left"/>
+      <w:pPr>
+        <w:ind w:left="6480" w:hanging="360"/>
+      </w:pPr>
+      <w:rPr>
+        <w:rFonts w:ascii="Wingdings" w:hAnsi="Wingdings" w:hint="default"/>
+      </w:rPr>
+    </w:lvl>
+  </w:abstractNum>
+  <w:abstractNum w:abstractNumId="5" w15:restartNumberingAfterBreak="0">
+    <w:nsid w:val="5324433C"/>
+    <w:multiLevelType w:val="hybridMultilevel"/>
+    <w:tmpl w:val="4978CF66"/>
+    <w:lvl w:ilvl="0" w:tplc="08090001">
+      <w:start w:val="1"/>
+      <w:numFmt w:val="bullet"/>
+      <w:lvlText w:val=""/>
+      <w:lvlJc w:val="left"/>
+      <w:pPr>
+        <w:ind w:left="720" w:hanging="360"/>
+      </w:pPr>
+      <w:rPr>
+        <w:rFonts w:ascii="Symbol" w:hAnsi="Symbol" w:hint="default"/>
+      </w:rPr>
+    </w:lvl>
+    <w:lvl w:ilvl="1" w:tplc="08160003" w:tentative="1">
+      <w:start w:val="1"/>
+      <w:numFmt w:val="bullet"/>
+      <w:lvlText w:val="o"/>
+      <w:lvlJc w:val="left"/>
+      <w:pPr>
+        <w:ind w:left="1440" w:hanging="360"/>
+      </w:pPr>
+      <w:rPr>
+        <w:rFonts w:ascii="Courier New" w:hAnsi="Courier New" w:cs="Courier New" w:hint="default"/>
+      </w:rPr>
+    </w:lvl>
+    <w:lvl w:ilvl="2" w:tplc="08160005" w:tentative="1">
+      <w:start w:val="1"/>
+      <w:numFmt w:val="bullet"/>
+      <w:lvlText w:val=""/>
+      <w:lvlJc w:val="left"/>
+      <w:pPr>
+        <w:ind w:left="2160" w:hanging="360"/>
+      </w:pPr>
+      <w:rPr>
+        <w:rFonts w:ascii="Wingdings" w:hAnsi="Wingdings" w:hint="default"/>
+      </w:rPr>
+    </w:lvl>
+    <w:lvl w:ilvl="3" w:tplc="08160001" w:tentative="1">
+      <w:start w:val="1"/>
+      <w:numFmt w:val="bullet"/>
+      <w:lvlText w:val=""/>
+      <w:lvlJc w:val="left"/>
+      <w:pPr>
+        <w:ind w:left="2880" w:hanging="360"/>
+      </w:pPr>
+      <w:rPr>
+        <w:rFonts w:ascii="Symbol" w:hAnsi="Symbol" w:hint="default"/>
+      </w:rPr>
+    </w:lvl>
+    <w:lvl w:ilvl="4" w:tplc="08160003" w:tentative="1">
+      <w:start w:val="1"/>
+      <w:numFmt w:val="bullet"/>
+      <w:lvlText w:val="o"/>
+      <w:lvlJc w:val="left"/>
+      <w:pPr>
+        <w:ind w:left="3600" w:hanging="360"/>
+      </w:pPr>
+      <w:rPr>
+        <w:rFonts w:ascii="Courier New" w:hAnsi="Courier New" w:cs="Courier New" w:hint="default"/>
+      </w:rPr>
+    </w:lvl>
+    <w:lvl w:ilvl="5" w:tplc="08160005" w:tentative="1">
+      <w:start w:val="1"/>
+      <w:numFmt w:val="bullet"/>
+      <w:lvlText w:val=""/>
+      <w:lvlJc w:val="left"/>
+      <w:pPr>
+        <w:ind w:left="4320" w:hanging="360"/>
+      </w:pPr>
+      <w:rPr>
+        <w:rFonts w:ascii="Wingdings" w:hAnsi="Wingdings" w:hint="default"/>
+      </w:rPr>
+    </w:lvl>
+    <w:lvl w:ilvl="6" w:tplc="08160001" w:tentative="1">
+      <w:start w:val="1"/>
+      <w:numFmt w:val="bullet"/>
+      <w:lvlText w:val=""/>
+      <w:lvlJc w:val="left"/>
+      <w:pPr>
+        <w:ind w:left="5040" w:hanging="360"/>
+      </w:pPr>
+      <w:rPr>
+        <w:rFonts w:ascii="Symbol" w:hAnsi="Symbol" w:hint="default"/>
+      </w:rPr>
+    </w:lvl>
+    <w:lvl w:ilvl="7" w:tplc="08160003" w:tentative="1">
+      <w:start w:val="1"/>
+      <w:numFmt w:val="bullet"/>
+      <w:lvlText w:val="o"/>
+      <w:lvlJc w:val="left"/>
+      <w:pPr>
+        <w:ind w:left="5760" w:hanging="360"/>
+      </w:pPr>
+      <w:rPr>
+        <w:rFonts w:ascii="Courier New" w:hAnsi="Courier New" w:cs="Courier New" w:hint="default"/>
+      </w:rPr>
+    </w:lvl>
+    <w:lvl w:ilvl="8" w:tplc="08160005" w:tentative="1">
+      <w:start w:val="1"/>
+      <w:numFmt w:val="bullet"/>
+      <w:lvlText w:val=""/>
+      <w:lvlJc w:val="left"/>
+      <w:pPr>
+        <w:ind w:left="6480" w:hanging="360"/>
+      </w:pPr>
+      <w:rPr>
+        <w:rFonts w:ascii="Wingdings" w:hAnsi="Wingdings" w:hint="default"/>
+      </w:rPr>
+    </w:lvl>
+  </w:abstractNum>
+  <w:abstractNum w:abstractNumId="6" w15:restartNumberingAfterBreak="0">
     <w:nsid w:val="5B0F18B6"/>
     <w:multiLevelType w:val="hybridMultilevel"/>
     <w:tmpl w:val="4D181508"/>
@@ -8819,7 +8644,7 @@
       </w:rPr>
     </w:lvl>
   </w:abstractNum>
-  <w:abstractNum w:abstractNumId="5" w15:restartNumberingAfterBreak="0">
+  <w:abstractNum w:abstractNumId="7" w15:restartNumberingAfterBreak="0">
     <w:nsid w:val="5EFF347A"/>
     <w:multiLevelType w:val="hybridMultilevel"/>
     <w:tmpl w:val="F9ACE60E"/>
@@ -8932,7 +8757,7 @@
       </w:rPr>
     </w:lvl>
   </w:abstractNum>
-  <w:abstractNum w:abstractNumId="6" w15:restartNumberingAfterBreak="0">
+  <w:abstractNum w:abstractNumId="8" w15:restartNumberingAfterBreak="0">
     <w:nsid w:val="605A194D"/>
     <w:multiLevelType w:val="hybridMultilevel"/>
     <w:tmpl w:val="96A856DA"/>
@@ -9045,7 +8870,120 @@
       </w:rPr>
     </w:lvl>
   </w:abstractNum>
-  <w:abstractNum w:abstractNumId="7" w15:restartNumberingAfterBreak="0">
+  <w:abstractNum w:abstractNumId="9" w15:restartNumberingAfterBreak="0">
+    <w:nsid w:val="6DA76006"/>
+    <w:multiLevelType w:val="hybridMultilevel"/>
+    <w:tmpl w:val="1178819E"/>
+    <w:lvl w:ilvl="0" w:tplc="08160001">
+      <w:start w:val="1"/>
+      <w:numFmt w:val="bullet"/>
+      <w:lvlText w:val=""/>
+      <w:lvlJc w:val="left"/>
+      <w:pPr>
+        <w:ind w:left="720" w:hanging="360"/>
+      </w:pPr>
+      <w:rPr>
+        <w:rFonts w:ascii="Symbol" w:hAnsi="Symbol" w:hint="default"/>
+      </w:rPr>
+    </w:lvl>
+    <w:lvl w:ilvl="1" w:tplc="08160003" w:tentative="1">
+      <w:start w:val="1"/>
+      <w:numFmt w:val="bullet"/>
+      <w:lvlText w:val="o"/>
+      <w:lvlJc w:val="left"/>
+      <w:pPr>
+        <w:ind w:left="1440" w:hanging="360"/>
+      </w:pPr>
+      <w:rPr>
+        <w:rFonts w:ascii="Courier New" w:hAnsi="Courier New" w:cs="Courier New" w:hint="default"/>
+      </w:rPr>
+    </w:lvl>
+    <w:lvl w:ilvl="2" w:tplc="08160005" w:tentative="1">
+      <w:start w:val="1"/>
+      <w:numFmt w:val="bullet"/>
+      <w:lvlText w:val=""/>
+      <w:lvlJc w:val="left"/>
+      <w:pPr>
+        <w:ind w:left="2160" w:hanging="360"/>
+      </w:pPr>
+      <w:rPr>
+        <w:rFonts w:ascii="Wingdings" w:hAnsi="Wingdings" w:hint="default"/>
+      </w:rPr>
+    </w:lvl>
+    <w:lvl w:ilvl="3" w:tplc="08160001" w:tentative="1">
+      <w:start w:val="1"/>
+      <w:numFmt w:val="bullet"/>
+      <w:lvlText w:val=""/>
+      <w:lvlJc w:val="left"/>
+      <w:pPr>
+        <w:ind w:left="2880" w:hanging="360"/>
+      </w:pPr>
+      <w:rPr>
+        <w:rFonts w:ascii="Symbol" w:hAnsi="Symbol" w:hint="default"/>
+      </w:rPr>
+    </w:lvl>
+    <w:lvl w:ilvl="4" w:tplc="08160003" w:tentative="1">
+      <w:start w:val="1"/>
+      <w:numFmt w:val="bullet"/>
+      <w:lvlText w:val="o"/>
+      <w:lvlJc w:val="left"/>
+      <w:pPr>
+        <w:ind w:left="3600" w:hanging="360"/>
+      </w:pPr>
+      <w:rPr>
+        <w:rFonts w:ascii="Courier New" w:hAnsi="Courier New" w:cs="Courier New" w:hint="default"/>
+      </w:rPr>
+    </w:lvl>
+    <w:lvl w:ilvl="5" w:tplc="08160005" w:tentative="1">
+      <w:start w:val="1"/>
+      <w:numFmt w:val="bullet"/>
+      <w:lvlText w:val=""/>
+      <w:lvlJc w:val="left"/>
+      <w:pPr>
+        <w:ind w:left="4320" w:hanging="360"/>
+      </w:pPr>
+      <w:rPr>
+        <w:rFonts w:ascii="Wingdings" w:hAnsi="Wingdings" w:hint="default"/>
+      </w:rPr>
+    </w:lvl>
+    <w:lvl w:ilvl="6" w:tplc="08160001" w:tentative="1">
+      <w:start w:val="1"/>
+      <w:numFmt w:val="bullet"/>
+      <w:lvlText w:val=""/>
+      <w:lvlJc w:val="left"/>
+      <w:pPr>
+        <w:ind w:left="5040" w:hanging="360"/>
+      </w:pPr>
+      <w:rPr>
+        <w:rFonts w:ascii="Symbol" w:hAnsi="Symbol" w:hint="default"/>
+      </w:rPr>
+    </w:lvl>
+    <w:lvl w:ilvl="7" w:tplc="08160003" w:tentative="1">
+      <w:start w:val="1"/>
+      <w:numFmt w:val="bullet"/>
+      <w:lvlText w:val="o"/>
+      <w:lvlJc w:val="left"/>
+      <w:pPr>
+        <w:ind w:left="5760" w:hanging="360"/>
+      </w:pPr>
+      <w:rPr>
+        <w:rFonts w:ascii="Courier New" w:hAnsi="Courier New" w:cs="Courier New" w:hint="default"/>
+      </w:rPr>
+    </w:lvl>
+    <w:lvl w:ilvl="8" w:tplc="08160005" w:tentative="1">
+      <w:start w:val="1"/>
+      <w:numFmt w:val="bullet"/>
+      <w:lvlText w:val=""/>
+      <w:lvlJc w:val="left"/>
+      <w:pPr>
+        <w:ind w:left="6480" w:hanging="360"/>
+      </w:pPr>
+      <w:rPr>
+        <w:rFonts w:ascii="Wingdings" w:hAnsi="Wingdings" w:hint="default"/>
+      </w:rPr>
+    </w:lvl>
+  </w:abstractNum>
+  <w:abstractNum w:abstractNumId="10" w15:restartNumberingAfterBreak="0">
     <w:nsid w:val="7EAA1B50"/>
     <w:multiLevelType w:val="hybridMultilevel"/>
     <w:tmpl w:val="DECAA814"/>
@@ -9159,7 +9097,7 @@
     </w:lvl>
   </w:abstractNum>
   <w:num w:numId="1" w16cid:durableId="573441266">
-    <w:abstractNumId w:val="4"/>
+    <w:abstractNumId w:val="6"/>
   </w:num>
   <w:num w:numId="2" w16cid:durableId="400371558">
     <w:abstractNumId w:val="0"/>
@@ -9168,25 +9106,34 @@
     <w:abstractNumId w:val="2"/>
   </w:num>
   <w:num w:numId="4" w16cid:durableId="358822454">
-    <w:abstractNumId w:val="5"/>
+    <w:abstractNumId w:val="7"/>
   </w:num>
   <w:num w:numId="5" w16cid:durableId="1718972657">
     <w:abstractNumId w:val="1"/>
   </w:num>
   <w:num w:numId="6" w16cid:durableId="206531947">
-    <w:abstractNumId w:val="6"/>
+    <w:abstractNumId w:val="8"/>
   </w:num>
   <w:num w:numId="7" w16cid:durableId="1098065181">
-    <w:abstractNumId w:val="7"/>
+    <w:abstractNumId w:val="10"/>
   </w:num>
   <w:num w:numId="8" w16cid:durableId="1939212983">
     <w:abstractNumId w:val="3"/>
+  </w:num>
+  <w:num w:numId="9" w16cid:durableId="1072121546">
+    <w:abstractNumId w:val="9"/>
+  </w:num>
+  <w:num w:numId="10" w16cid:durableId="852767728">
+    <w:abstractNumId w:val="4"/>
+  </w:num>
+  <w:num w:numId="11" w16cid:durableId="1146314029">
+    <w:abstractNumId w:val="5"/>
   </w:num>
 </w:numbering>
 </file>
 
 <file path=word/styles.xml><?xml version="1.0" encoding="utf-8"?>
-<w:styles xmlns:mc="http://schemas.openxmlformats.org/markup-compatibility/2006" xmlns:r="http://schemas.openxmlformats.org/officeDocument/2006/relationships" xmlns:w="http://schemas.openxmlformats.org/wordprocessingml/2006/main" xmlns:w14="http://schemas.microsoft.com/office/word/2010/wordml" xmlns:w15="http://schemas.microsoft.com/office/word/2012/wordml" xmlns:w16cex="http://schemas.microsoft.com/office/word/2018/wordml/cex" xmlns:w16cid="http://schemas.microsoft.com/office/word/2016/wordml/cid" xmlns:w16="http://schemas.microsoft.com/office/word/2018/wordml" xmlns:w16sdtdh="http://schemas.microsoft.com/office/word/2020/wordml/sdtdatahash" xmlns:w16se="http://schemas.microsoft.com/office/word/2015/wordml/symex" mc:Ignorable="w14 w15 w16se w16cid w16 w16cex w16sdtdh">
+<w:styles xmlns:mc="http://schemas.openxmlformats.org/markup-compatibility/2006" xmlns:r="http://schemas.openxmlformats.org/officeDocument/2006/relationships" xmlns:w="http://schemas.openxmlformats.org/wordprocessingml/2006/main" xmlns:w14="http://schemas.microsoft.com/office/word/2010/wordml" xmlns:w15="http://schemas.microsoft.com/office/word/2012/wordml" xmlns:w16cex="http://schemas.microsoft.com/office/word/2018/wordml/cex" xmlns:w16cid="http://schemas.microsoft.com/office/word/2016/wordml/cid" xmlns:w16="http://schemas.microsoft.com/office/word/2018/wordml" xmlns:w16du="http://schemas.microsoft.com/office/word/2023/wordml/word16du" xmlns:w16sdtdh="http://schemas.microsoft.com/office/word/2020/wordml/sdtdatahash" xmlns:w16sdtfl="http://schemas.microsoft.com/office/word/2024/wordml/sdtformatlock" xmlns:w16se="http://schemas.microsoft.com/office/word/2015/wordml/symex" mc:Ignorable="w14 w15 w16se w16cid w16 w16cex w16sdtdh w16sdtfl w16du">
   <w:docDefaults>
     <w:rPrDefault>
       <w:rPr>
@@ -9587,13 +9534,13 @@
       <w:lang w:val="en-GB"/>
     </w:rPr>
   </w:style>
-  <w:style w:type="character" w:default="1" w:styleId="DefaultParagraphFont">
+  <w:style w:type="character" w:default="1" w:styleId="Tipodeletrapredefinidodopargrafo">
     <w:name w:val="Default Paragraph Font"/>
     <w:uiPriority w:val="1"/>
     <w:semiHidden/>
     <w:unhideWhenUsed/>
   </w:style>
-  <w:style w:type="table" w:default="1" w:styleId="TableNormal">
+  <w:style w:type="table" w:default="1" w:styleId="Tabelanormal">
     <w:name w:val="Normal Table"/>
     <w:uiPriority w:val="99"/>
     <w:semiHidden/>
@@ -9608,16 +9555,16 @@
       </w:tblCellMar>
     </w:tblPr>
   </w:style>
-  <w:style w:type="numbering" w:default="1" w:styleId="NoList">
+  <w:style w:type="numbering" w:default="1" w:styleId="Semlista">
     <w:name w:val="No List"/>
     <w:uiPriority w:val="99"/>
     <w:semiHidden/>
     <w:unhideWhenUsed/>
   </w:style>
-  <w:style w:type="paragraph" w:styleId="Header">
+  <w:style w:type="paragraph" w:styleId="Cabealho">
     <w:name w:val="header"/>
     <w:basedOn w:val="Normal"/>
-    <w:link w:val="HeaderChar"/>
+    <w:link w:val="CabealhoCarter"/>
     <w:uiPriority w:val="99"/>
     <w:semiHidden/>
     <w:unhideWhenUsed/>
@@ -9630,10 +9577,10 @@
       <w:spacing w:after="0" w:line="240" w:lineRule="auto"/>
     </w:pPr>
   </w:style>
-  <w:style w:type="character" w:customStyle="1" w:styleId="HeaderChar">
-    <w:name w:val="Header Char"/>
-    <w:basedOn w:val="DefaultParagraphFont"/>
-    <w:link w:val="Header"/>
+  <w:style w:type="character" w:customStyle="1" w:styleId="CabealhoCarter">
+    <w:name w:val="Cabeçalho Caráter"/>
+    <w:basedOn w:val="Tipodeletrapredefinidodopargrafo"/>
+    <w:link w:val="Cabealho"/>
     <w:uiPriority w:val="99"/>
     <w:semiHidden/>
     <w:rsid w:val="00CE247C"/>
@@ -9641,10 +9588,10 @@
       <w:lang w:val="en-GB"/>
     </w:rPr>
   </w:style>
-  <w:style w:type="paragraph" w:styleId="Footer">
+  <w:style w:type="paragraph" w:styleId="Rodap">
     <w:name w:val="footer"/>
     <w:basedOn w:val="Normal"/>
-    <w:link w:val="FooterChar"/>
+    <w:link w:val="RodapCarter"/>
     <w:uiPriority w:val="99"/>
     <w:semiHidden/>
     <w:unhideWhenUsed/>
@@ -9657,10 +9604,10 @@
       <w:spacing w:after="0" w:line="240" w:lineRule="auto"/>
     </w:pPr>
   </w:style>
-  <w:style w:type="character" w:customStyle="1" w:styleId="FooterChar">
-    <w:name w:val="Footer Char"/>
-    <w:basedOn w:val="DefaultParagraphFont"/>
-    <w:link w:val="Footer"/>
+  <w:style w:type="character" w:customStyle="1" w:styleId="RodapCarter">
+    <w:name w:val="Rodapé Caráter"/>
+    <w:basedOn w:val="Tipodeletrapredefinidodopargrafo"/>
+    <w:link w:val="Rodap"/>
     <w:uiPriority w:val="99"/>
     <w:semiHidden/>
     <w:rsid w:val="00CE247C"/>
@@ -9668,9 +9615,9 @@
       <w:lang w:val="en-GB"/>
     </w:rPr>
   </w:style>
-  <w:style w:type="table" w:styleId="GridTable2-Accent3">
+  <w:style w:type="table" w:styleId="TabeladeGrelha2-Destaque3">
     <w:name w:val="Grid Table 2 Accent 3"/>
-    <w:basedOn w:val="TableNormal"/>
+    <w:basedOn w:val="Tabelanormal"/>
     <w:uiPriority w:val="47"/>
     <w:rsid w:val="00CE247C"/>
     <w:pPr>
@@ -9743,9 +9690,9 @@
       </w:tcPr>
     </w:tblStylePr>
   </w:style>
-  <w:style w:type="table" w:styleId="ListTable6Colorful-Accent3">
+  <w:style w:type="table" w:styleId="TabeladeLista6Colorida-Destaque3">
     <w:name w:val="List Table 6 Colorful Accent 3"/>
-    <w:basedOn w:val="TableNormal"/>
+    <w:basedOn w:val="Tabelanormal"/>
     <w:uiPriority w:val="51"/>
     <w:rsid w:val="00CE247C"/>
     <w:pPr>
@@ -9811,7 +9758,7 @@
       </w:tcPr>
     </w:tblStylePr>
   </w:style>
-  <w:style w:type="paragraph" w:styleId="ListParagraph">
+  <w:style w:type="paragraph" w:styleId="PargrafodaLista">
     <w:name w:val="List Paragraph"/>
     <w:basedOn w:val="Normal"/>
     <w:uiPriority w:val="34"/>

</xml_diff>